<commit_message>
chore: generate weekly GitHub trending report 2026-07-20
</commit_message>
<xml_diff>
--- a/output/reports/GitHub每周热点项目推荐_2026-07-20.docx
+++ b/output/reports/GitHub每周热点项目推荐_2026-07-20.docx
@@ -66,7 +66,7 @@
         <w:jc w:val="center"/>
       </w:pPr>
       <w:r>
-        <w:t>统计范围：截至 2026-07-20 00:07 JST 的近 7 天</w:t>
+        <w:t>统计范围：截至 2026-07-20 00:38 JST 的近 7 天</w:t>
       </w:r>
     </w:p>
     <w:p>
@@ -156,7 +156,7 @@
     </w:p>
     <w:p>
       <w:r>
-        <w:t>本周候选项目覆盖 2 个领域，热点集中在编程开发工具、人工智能与大模型。最值得优先关注的是 agent-lab、local-llm-kit、swift-web。榜单兼顾近期增长、持续维护、README 完整度和实际使用价值，并通过分类配额避免单一领域占满。普通用户应优先选择安装路径清晰、带桌面界面或一键部署的项目；专业开发者可重点关注基础设施、Agent 与开发工具。这是首次运行，周增长缺少基线，部分热度使用近期活跃度代理估算。</w:t>
+        <w:t>本周候选项目覆盖 6 个领域，热点集中在编程开发工具、自动化工具、AI Agent、人工智能与大模型、效率工具。最值得优先关注的是 openclaw、n8n、ollama。榜单兼顾近期增长、持续维护、README 完整度和实际使用价值，并通过分类配额避免单一领域占满。普通用户应优先选择安装路径清晰、带桌面界面或一键部署的项目；专业开发者可重点关注基础设施、Agent 与开发工具。本期周增长来自历史快照。</w:t>
       </w:r>
     </w:p>
     <w:p>
@@ -301,7 +301,7 @@
           </w:tcPr>
           <w:p>
             <w:r>
-              <w:t>agent-lab</w:t>
+              <w:t>openclaw</w:t>
             </w:r>
           </w:p>
         </w:tc>
@@ -334,7 +334,7 @@
           </w:tcPr>
           <w:p>
             <w:r>
-              <w:t>30,000</w:t>
+              <w:t>383,468</w:t>
             </w:r>
           </w:p>
         </w:tc>
@@ -345,7 +345,7 @@
           </w:tcPr>
           <w:p>
             <w:r>
-              <w:t>Python</w:t>
+              <w:t>TypeScript</w:t>
             </w:r>
           </w:p>
         </w:tc>
@@ -356,7 +356,7 @@
           </w:tcPr>
           <w:p>
             <w:r>
-              <w:t>2.9</w:t>
+              <w:t>2.8</w:t>
             </w:r>
           </w:p>
         </w:tc>
@@ -398,7 +398,7 @@
           </w:tcPr>
           <w:p>
             <w:r>
-              <w:t>local-llm-kit</w:t>
+              <w:t>n8n</w:t>
             </w:r>
           </w:p>
         </w:tc>
@@ -409,7 +409,7 @@
           </w:tcPr>
           <w:p>
             <w:r>
-              <w:t>人工智能与大模型</w:t>
+              <w:t>自动化工具</w:t>
             </w:r>
           </w:p>
         </w:tc>
@@ -431,7 +431,7 @@
           </w:tcPr>
           <w:p>
             <w:r>
-              <w:t>28,200</w:t>
+              <w:t>197,046</w:t>
             </w:r>
           </w:p>
         </w:tc>
@@ -442,7 +442,7 @@
           </w:tcPr>
           <w:p>
             <w:r>
-              <w:t>Python</w:t>
+              <w:t>TypeScript</w:t>
             </w:r>
           </w:p>
         </w:tc>
@@ -453,7 +453,7 @@
           </w:tcPr>
           <w:p>
             <w:r>
-              <w:t>2.9</w:t>
+              <w:t>2.8</w:t>
             </w:r>
           </w:p>
         </w:tc>
@@ -495,7 +495,7 @@
           </w:tcPr>
           <w:p>
             <w:r>
-              <w:t>swift-web</w:t>
+              <w:t>ollama</w:t>
             </w:r>
           </w:p>
         </w:tc>
@@ -506,7 +506,7 @@
           </w:tcPr>
           <w:p>
             <w:r>
-              <w:t>编程开发工具</w:t>
+              <w:t>人工智能与大模型</w:t>
             </w:r>
           </w:p>
         </w:tc>
@@ -528,7 +528,7 @@
           </w:tcPr>
           <w:p>
             <w:r>
-              <w:t>26,400</w:t>
+              <w:t>176,447</w:t>
             </w:r>
           </w:p>
         </w:tc>
@@ -539,7 +539,7 @@
           </w:tcPr>
           <w:p>
             <w:r>
-              <w:t>TypeScript</w:t>
+              <w:t>Go</w:t>
             </w:r>
           </w:p>
         </w:tc>
@@ -573,6 +573,685 @@
           </w:p>
         </w:tc>
       </w:tr>
+      <w:tr>
+        <w:tc>
+          <w:tcPr>
+            <w:tcW w:type="dxa" w:w="504"/>
+            <w:vAlign w:val="center"/>
+          </w:tcPr>
+          <w:p>
+            <w:r>
+              <w:t>4</w:t>
+            </w:r>
+          </w:p>
+        </w:tc>
+        <w:tc>
+          <w:tcPr>
+            <w:tcW w:type="dxa" w:w="1440"/>
+            <w:vAlign w:val="center"/>
+          </w:tcPr>
+          <w:p>
+            <w:r>
+              <w:t>AutoGPT</w:t>
+            </w:r>
+          </w:p>
+        </w:tc>
+        <w:tc>
+          <w:tcPr>
+            <w:tcW w:type="dxa" w:w="1296"/>
+            <w:vAlign w:val="center"/>
+          </w:tcPr>
+          <w:p>
+            <w:r>
+              <w:t>人工智能与大模型</w:t>
+            </w:r>
+          </w:p>
+        </w:tc>
+        <w:tc>
+          <w:tcPr>
+            <w:tcW w:type="dxa" w:w="1037"/>
+            <w:vAlign w:val="center"/>
+          </w:tcPr>
+          <w:p>
+            <w:r>
+              <w:t>0</w:t>
+            </w:r>
+          </w:p>
+        </w:tc>
+        <w:tc>
+          <w:tcPr>
+            <w:tcW w:type="dxa" w:w="936"/>
+            <w:vAlign w:val="center"/>
+          </w:tcPr>
+          <w:p>
+            <w:r>
+              <w:t>185,611</w:t>
+            </w:r>
+          </w:p>
+        </w:tc>
+        <w:tc>
+          <w:tcPr>
+            <w:tcW w:type="dxa" w:w="1008"/>
+            <w:vAlign w:val="center"/>
+          </w:tcPr>
+          <w:p>
+            <w:r>
+              <w:t>Python</w:t>
+            </w:r>
+          </w:p>
+        </w:tc>
+        <w:tc>
+          <w:tcPr>
+            <w:tcW w:type="dxa" w:w="893"/>
+            <w:vAlign w:val="center"/>
+          </w:tcPr>
+          <w:p>
+            <w:r>
+              <w:t>2.8</w:t>
+            </w:r>
+          </w:p>
+        </w:tc>
+        <w:tc>
+          <w:tcPr>
+            <w:tcW w:type="dxa" w:w="2246"/>
+            <w:vAlign w:val="center"/>
+          </w:tcPr>
+          <w:p>
+            <w:r/>
+            <w:hyperlink r:id="rId14">
+              <w:r>
+                <w:rPr>
+                  <w:color w:val="0563C1"/>
+                  <w:u w:val="single"/>
+                </w:rPr>
+                <w:t>GitHub</w:t>
+              </w:r>
+            </w:hyperlink>
+          </w:p>
+        </w:tc>
+      </w:tr>
+      <w:tr>
+        <w:tc>
+          <w:tcPr>
+            <w:tcW w:type="dxa" w:w="504"/>
+            <w:vAlign w:val="center"/>
+          </w:tcPr>
+          <w:p>
+            <w:r>
+              <w:t>5</w:t>
+            </w:r>
+          </w:p>
+        </w:tc>
+        <w:tc>
+          <w:tcPr>
+            <w:tcW w:type="dxa" w:w="1440"/>
+            <w:vAlign w:val="center"/>
+          </w:tcPr>
+          <w:p>
+            <w:r>
+              <w:t>opencode</w:t>
+            </w:r>
+          </w:p>
+        </w:tc>
+        <w:tc>
+          <w:tcPr>
+            <w:tcW w:type="dxa" w:w="1296"/>
+            <w:vAlign w:val="center"/>
+          </w:tcPr>
+          <w:p>
+            <w:r>
+              <w:t>AI Agent</w:t>
+            </w:r>
+          </w:p>
+        </w:tc>
+        <w:tc>
+          <w:tcPr>
+            <w:tcW w:type="dxa" w:w="1037"/>
+            <w:vAlign w:val="center"/>
+          </w:tcPr>
+          <w:p>
+            <w:r>
+              <w:t>0</w:t>
+            </w:r>
+          </w:p>
+        </w:tc>
+        <w:tc>
+          <w:tcPr>
+            <w:tcW w:type="dxa" w:w="936"/>
+            <w:vAlign w:val="center"/>
+          </w:tcPr>
+          <w:p>
+            <w:r>
+              <w:t>187,431</w:t>
+            </w:r>
+          </w:p>
+        </w:tc>
+        <w:tc>
+          <w:tcPr>
+            <w:tcW w:type="dxa" w:w="1008"/>
+            <w:vAlign w:val="center"/>
+          </w:tcPr>
+          <w:p>
+            <w:r>
+              <w:t>TypeScript</w:t>
+            </w:r>
+          </w:p>
+        </w:tc>
+        <w:tc>
+          <w:tcPr>
+            <w:tcW w:type="dxa" w:w="893"/>
+            <w:vAlign w:val="center"/>
+          </w:tcPr>
+          <w:p>
+            <w:r>
+              <w:t>2.8</w:t>
+            </w:r>
+          </w:p>
+        </w:tc>
+        <w:tc>
+          <w:tcPr>
+            <w:tcW w:type="dxa" w:w="2246"/>
+            <w:vAlign w:val="center"/>
+          </w:tcPr>
+          <w:p>
+            <w:r/>
+            <w:hyperlink r:id="rId15">
+              <w:r>
+                <w:rPr>
+                  <w:color w:val="0563C1"/>
+                  <w:u w:val="single"/>
+                </w:rPr>
+                <w:t>GitHub</w:t>
+              </w:r>
+            </w:hyperlink>
+          </w:p>
+        </w:tc>
+      </w:tr>
+      <w:tr>
+        <w:tc>
+          <w:tcPr>
+            <w:tcW w:type="dxa" w:w="504"/>
+            <w:vAlign w:val="center"/>
+          </w:tcPr>
+          <w:p>
+            <w:r>
+              <w:t>6</w:t>
+            </w:r>
+          </w:p>
+        </w:tc>
+        <w:tc>
+          <w:tcPr>
+            <w:tcW w:type="dxa" w:w="1440"/>
+            <w:vAlign w:val="center"/>
+          </w:tcPr>
+          <w:p>
+            <w:r>
+              <w:t>vscode</w:t>
+            </w:r>
+          </w:p>
+        </w:tc>
+        <w:tc>
+          <w:tcPr>
+            <w:tcW w:type="dxa" w:w="1296"/>
+            <w:vAlign w:val="center"/>
+          </w:tcPr>
+          <w:p>
+            <w:r>
+              <w:t>Web 前端</w:t>
+            </w:r>
+          </w:p>
+        </w:tc>
+        <w:tc>
+          <w:tcPr>
+            <w:tcW w:type="dxa" w:w="1037"/>
+            <w:vAlign w:val="center"/>
+          </w:tcPr>
+          <w:p>
+            <w:r>
+              <w:t>0</w:t>
+            </w:r>
+          </w:p>
+        </w:tc>
+        <w:tc>
+          <w:tcPr>
+            <w:tcW w:type="dxa" w:w="936"/>
+            <w:vAlign w:val="center"/>
+          </w:tcPr>
+          <w:p>
+            <w:r>
+              <w:t>187,678</w:t>
+            </w:r>
+          </w:p>
+        </w:tc>
+        <w:tc>
+          <w:tcPr>
+            <w:tcW w:type="dxa" w:w="1008"/>
+            <w:vAlign w:val="center"/>
+          </w:tcPr>
+          <w:p>
+            <w:r>
+              <w:t>TypeScript</w:t>
+            </w:r>
+          </w:p>
+        </w:tc>
+        <w:tc>
+          <w:tcPr>
+            <w:tcW w:type="dxa" w:w="893"/>
+            <w:vAlign w:val="center"/>
+          </w:tcPr>
+          <w:p>
+            <w:r>
+              <w:t>2.8</w:t>
+            </w:r>
+          </w:p>
+        </w:tc>
+        <w:tc>
+          <w:tcPr>
+            <w:tcW w:type="dxa" w:w="2246"/>
+            <w:vAlign w:val="center"/>
+          </w:tcPr>
+          <w:p>
+            <w:r/>
+            <w:hyperlink r:id="rId16">
+              <w:r>
+                <w:rPr>
+                  <w:color w:val="0563C1"/>
+                  <w:u w:val="single"/>
+                </w:rPr>
+                <w:t>GitHub</w:t>
+              </w:r>
+            </w:hyperlink>
+          </w:p>
+        </w:tc>
+      </w:tr>
+      <w:tr>
+        <w:tc>
+          <w:tcPr>
+            <w:tcW w:type="dxa" w:w="504"/>
+            <w:vAlign w:val="center"/>
+          </w:tcPr>
+          <w:p>
+            <w:r>
+              <w:t>7</w:t>
+            </w:r>
+          </w:p>
+        </w:tc>
+        <w:tc>
+          <w:tcPr>
+            <w:tcW w:type="dxa" w:w="1440"/>
+            <w:vAlign w:val="center"/>
+          </w:tcPr>
+          <w:p>
+            <w:r>
+              <w:t>skills</w:t>
+            </w:r>
+          </w:p>
+        </w:tc>
+        <w:tc>
+          <w:tcPr>
+            <w:tcW w:type="dxa" w:w="1296"/>
+            <w:vAlign w:val="center"/>
+          </w:tcPr>
+          <w:p>
+            <w:r>
+              <w:t>AI Agent</w:t>
+            </w:r>
+          </w:p>
+        </w:tc>
+        <w:tc>
+          <w:tcPr>
+            <w:tcW w:type="dxa" w:w="1037"/>
+            <w:vAlign w:val="center"/>
+          </w:tcPr>
+          <w:p>
+            <w:r>
+              <w:t>0</w:t>
+            </w:r>
+          </w:p>
+        </w:tc>
+        <w:tc>
+          <w:tcPr>
+            <w:tcW w:type="dxa" w:w="936"/>
+            <w:vAlign w:val="center"/>
+          </w:tcPr>
+          <w:p>
+            <w:r>
+              <w:t>177,201</w:t>
+            </w:r>
+          </w:p>
+        </w:tc>
+        <w:tc>
+          <w:tcPr>
+            <w:tcW w:type="dxa" w:w="1008"/>
+            <w:vAlign w:val="center"/>
+          </w:tcPr>
+          <w:p>
+            <w:r>
+              <w:t>Shell</w:t>
+            </w:r>
+          </w:p>
+        </w:tc>
+        <w:tc>
+          <w:tcPr>
+            <w:tcW w:type="dxa" w:w="893"/>
+            <w:vAlign w:val="center"/>
+          </w:tcPr>
+          <w:p>
+            <w:r>
+              <w:t>2.6</w:t>
+            </w:r>
+          </w:p>
+        </w:tc>
+        <w:tc>
+          <w:tcPr>
+            <w:tcW w:type="dxa" w:w="2246"/>
+            <w:vAlign w:val="center"/>
+          </w:tcPr>
+          <w:p>
+            <w:r/>
+            <w:hyperlink r:id="rId17">
+              <w:r>
+                <w:rPr>
+                  <w:color w:val="0563C1"/>
+                  <w:u w:val="single"/>
+                </w:rPr>
+                <w:t>GitHub</w:t>
+              </w:r>
+            </w:hyperlink>
+          </w:p>
+        </w:tc>
+      </w:tr>
+      <w:tr>
+        <w:tc>
+          <w:tcPr>
+            <w:tcW w:type="dxa" w:w="504"/>
+            <w:vAlign w:val="center"/>
+          </w:tcPr>
+          <w:p>
+            <w:r>
+              <w:t>8</w:t>
+            </w:r>
+          </w:p>
+        </w:tc>
+        <w:tc>
+          <w:tcPr>
+            <w:tcW w:type="dxa" w:w="1440"/>
+            <w:vAlign w:val="center"/>
+          </w:tcPr>
+          <w:p>
+            <w:r>
+              <w:t>Aether</w:t>
+            </w:r>
+          </w:p>
+        </w:tc>
+        <w:tc>
+          <w:tcPr>
+            <w:tcW w:type="dxa" w:w="1296"/>
+            <w:vAlign w:val="center"/>
+          </w:tcPr>
+          <w:p>
+            <w:r>
+              <w:t>编程开发工具</w:t>
+            </w:r>
+          </w:p>
+        </w:tc>
+        <w:tc>
+          <w:tcPr>
+            <w:tcW w:type="dxa" w:w="1037"/>
+            <w:vAlign w:val="center"/>
+          </w:tcPr>
+          <w:p>
+            <w:r>
+              <w:t>0</w:t>
+            </w:r>
+          </w:p>
+        </w:tc>
+        <w:tc>
+          <w:tcPr>
+            <w:tcW w:type="dxa" w:w="936"/>
+            <w:vAlign w:val="center"/>
+          </w:tcPr>
+          <w:p>
+            <w:r>
+              <w:t>1,293</w:t>
+            </w:r>
+          </w:p>
+        </w:tc>
+        <w:tc>
+          <w:tcPr>
+            <w:tcW w:type="dxa" w:w="1008"/>
+            <w:vAlign w:val="center"/>
+          </w:tcPr>
+          <w:p>
+            <w:r>
+              <w:t>Rust</w:t>
+            </w:r>
+          </w:p>
+        </w:tc>
+        <w:tc>
+          <w:tcPr>
+            <w:tcW w:type="dxa" w:w="893"/>
+            <w:vAlign w:val="center"/>
+          </w:tcPr>
+          <w:p>
+            <w:r>
+              <w:t>2.5</w:t>
+            </w:r>
+          </w:p>
+        </w:tc>
+        <w:tc>
+          <w:tcPr>
+            <w:tcW w:type="dxa" w:w="2246"/>
+            <w:vAlign w:val="center"/>
+          </w:tcPr>
+          <w:p>
+            <w:r/>
+            <w:hyperlink r:id="rId18">
+              <w:r>
+                <w:rPr>
+                  <w:color w:val="0563C1"/>
+                  <w:u w:val="single"/>
+                </w:rPr>
+                <w:t>GitHub</w:t>
+              </w:r>
+            </w:hyperlink>
+          </w:p>
+        </w:tc>
+      </w:tr>
+      <w:tr>
+        <w:tc>
+          <w:tcPr>
+            <w:tcW w:type="dxa" w:w="504"/>
+            <w:vAlign w:val="center"/>
+          </w:tcPr>
+          <w:p>
+            <w:r>
+              <w:t>9</w:t>
+            </w:r>
+          </w:p>
+        </w:tc>
+        <w:tc>
+          <w:tcPr>
+            <w:tcW w:type="dxa" w:w="1440"/>
+            <w:vAlign w:val="center"/>
+          </w:tcPr>
+          <w:p>
+            <w:r>
+              <w:t>Aether-GUI</w:t>
+            </w:r>
+          </w:p>
+        </w:tc>
+        <w:tc>
+          <w:tcPr>
+            <w:tcW w:type="dxa" w:w="1296"/>
+            <w:vAlign w:val="center"/>
+          </w:tcPr>
+          <w:p>
+            <w:r>
+              <w:t>Web 前端</w:t>
+            </w:r>
+          </w:p>
+        </w:tc>
+        <w:tc>
+          <w:tcPr>
+            <w:tcW w:type="dxa" w:w="1037"/>
+            <w:vAlign w:val="center"/>
+          </w:tcPr>
+          <w:p>
+            <w:r>
+              <w:t>0</w:t>
+            </w:r>
+          </w:p>
+        </w:tc>
+        <w:tc>
+          <w:tcPr>
+            <w:tcW w:type="dxa" w:w="936"/>
+            <w:vAlign w:val="center"/>
+          </w:tcPr>
+          <w:p>
+            <w:r>
+              <w:t>616</w:t>
+            </w:r>
+          </w:p>
+        </w:tc>
+        <w:tc>
+          <w:tcPr>
+            <w:tcW w:type="dxa" w:w="1008"/>
+            <w:vAlign w:val="center"/>
+          </w:tcPr>
+          <w:p>
+            <w:r>
+              <w:t>TypeScript</w:t>
+            </w:r>
+          </w:p>
+        </w:tc>
+        <w:tc>
+          <w:tcPr>
+            <w:tcW w:type="dxa" w:w="893"/>
+            <w:vAlign w:val="center"/>
+          </w:tcPr>
+          <w:p>
+            <w:r>
+              <w:t>2.5</w:t>
+            </w:r>
+          </w:p>
+        </w:tc>
+        <w:tc>
+          <w:tcPr>
+            <w:tcW w:type="dxa" w:w="2246"/>
+            <w:vAlign w:val="center"/>
+          </w:tcPr>
+          <w:p>
+            <w:r/>
+            <w:hyperlink r:id="rId19">
+              <w:r>
+                <w:rPr>
+                  <w:color w:val="0563C1"/>
+                  <w:u w:val="single"/>
+                </w:rPr>
+                <w:t>GitHub</w:t>
+              </w:r>
+            </w:hyperlink>
+          </w:p>
+        </w:tc>
+      </w:tr>
+      <w:tr>
+        <w:tc>
+          <w:tcPr>
+            <w:tcW w:type="dxa" w:w="504"/>
+            <w:vAlign w:val="center"/>
+          </w:tcPr>
+          <w:p>
+            <w:r>
+              <w:t>10</w:t>
+            </w:r>
+          </w:p>
+        </w:tc>
+        <w:tc>
+          <w:tcPr>
+            <w:tcW w:type="dxa" w:w="1440"/>
+            <w:vAlign w:val="center"/>
+          </w:tcPr>
+          <w:p>
+            <w:r>
+              <w:t>yt-dlp</w:t>
+            </w:r>
+          </w:p>
+        </w:tc>
+        <w:tc>
+          <w:tcPr>
+            <w:tcW w:type="dxa" w:w="1296"/>
+            <w:vAlign w:val="center"/>
+          </w:tcPr>
+          <w:p>
+            <w:r>
+              <w:t>效率工具</w:t>
+            </w:r>
+          </w:p>
+        </w:tc>
+        <w:tc>
+          <w:tcPr>
+            <w:tcW w:type="dxa" w:w="1037"/>
+            <w:vAlign w:val="center"/>
+          </w:tcPr>
+          <w:p>
+            <w:r>
+              <w:t>0</w:t>
+            </w:r>
+          </w:p>
+        </w:tc>
+        <w:tc>
+          <w:tcPr>
+            <w:tcW w:type="dxa" w:w="936"/>
+            <w:vAlign w:val="center"/>
+          </w:tcPr>
+          <w:p>
+            <w:r>
+              <w:t>178,872</w:t>
+            </w:r>
+          </w:p>
+        </w:tc>
+        <w:tc>
+          <w:tcPr>
+            <w:tcW w:type="dxa" w:w="1008"/>
+            <w:vAlign w:val="center"/>
+          </w:tcPr>
+          <w:p>
+            <w:r>
+              <w:t>Python</w:t>
+            </w:r>
+          </w:p>
+        </w:tc>
+        <w:tc>
+          <w:tcPr>
+            <w:tcW w:type="dxa" w:w="893"/>
+            <w:vAlign w:val="center"/>
+          </w:tcPr>
+          <w:p>
+            <w:r>
+              <w:t>2.4</w:t>
+            </w:r>
+          </w:p>
+        </w:tc>
+        <w:tc>
+          <w:tcPr>
+            <w:tcW w:type="dxa" w:w="2246"/>
+            <w:vAlign w:val="center"/>
+          </w:tcPr>
+          <w:p>
+            <w:r/>
+            <w:hyperlink r:id="rId20">
+              <w:r>
+                <w:rPr>
+                  <w:color w:val="0563C1"/>
+                  <w:u w:val="single"/>
+                </w:rPr>
+                <w:t>GitHub</w:t>
+              </w:r>
+            </w:hyperlink>
+          </w:p>
+        </w:tc>
+      </w:tr>
     </w:tbl>
     <w:p>
       <w:pPr>
@@ -587,7 +1266,7 @@
         <w:pStyle w:val="Heading2"/>
       </w:pPr>
       <w:r>
-        <w:t>3.1 agent-lab</w:t>
+        <w:t>3.1 openclaw</w:t>
       </w:r>
     </w:p>
     <w:p>
@@ -603,11 +1282,11 @@
               <a:graphicData uri="http://schemas.openxmlformats.org/drawingml/2006/picture">
                 <pic:pic>
                   <pic:nvPicPr>
-                    <pic:cNvPr id="0" name="demo__agent-lab.png"/>
+                    <pic:cNvPr id="0" name="openclaw__openclaw.png"/>
                     <pic:cNvPicPr/>
                   </pic:nvPicPr>
                   <pic:blipFill>
-                    <a:blip r:embed="rId14"/>
+                    <a:blip r:embed="rId21"/>
                     <a:stretch>
                       <a:fillRect/>
                     </a:stretch>
@@ -662,7 +1341,7 @@
           </w:tcPr>
           <w:p>
             <w:r>
-              <w:t>demo/agent-lab</w:t>
+              <w:t>openclaw/openclaw</w:t>
             </w:r>
           </w:p>
         </w:tc>
@@ -708,7 +1387,7 @@
           </w:tcPr>
           <w:p>
             <w:r>
-              <w:t>MIT / Python</w:t>
+              <w:t>NOASSERTION / TypeScript</w:t>
             </w:r>
           </w:p>
         </w:tc>
@@ -731,7 +1410,7 @@
           </w:tcPr>
           <w:p>
             <w:r>
-              <w:t>30,000 / 0 / 2,200</w:t>
+              <w:t>383,468 / 0 / 80,550</w:t>
             </w:r>
           </w:p>
         </w:tc>
@@ -754,7 +1433,7 @@
           </w:tcPr>
           <w:p>
             <w:r>
-              <w:t>2026-07-19 / v1.0.0</w:t>
+              <w:t>2026-07-19 / v2026.7.1</w:t>
             </w:r>
           </w:p>
         </w:tc>
@@ -793,7 +1472,7 @@
     </w:p>
     <w:p>
       <w:r>
-        <w:t>agent-lab 是人工智能与大模型领域项目。用于演示的AI Agent开源项目，提供清晰安装教程与可运行示例。</w:t>
+        <w:t xml:space="preserve">openclaw 是人工智能与大模型领域项目。Your own personal AI assistant. Any OS. Any Platform. The lobster way. 🦞 </w:t>
       </w:r>
     </w:p>
     <w:p>
@@ -819,7 +1498,7 @@
     </w:p>
     <w:p>
       <w:r>
-        <w:t>近期提交活跃，综合热度得分 58.1；本周新增 Star 0。首次运行时增长数字可能为估算。</w:t>
+        <w:t>近期提交活跃，综合热度得分 56.9；本周新增 Star 0。首次运行时增长数字可能为估算。</w:t>
       </w:r>
     </w:p>
     <w:p>
@@ -1034,7 +1713,7 @@
     </w:p>
     <w:p>
       <w:r>
-        <w:t>热度 2.9/5；实用性 4.0/5；创新性 3.8/5；易用性 3.2/5；项目成熟度 3.5/5；推荐指数 2.9/5。综合热度算法得分 58.1/100。</w:t>
+        <w:t>热度 2.8/5；实用性 4.0/5；创新性 3.8/5；易用性 3.2/5；项目成熟度 5.0/5；推荐指数 2.8/5。综合热度算法得分 56.9/100。</w:t>
       </w:r>
     </w:p>
     <w:p>
@@ -1050,7 +1729,7 @@
             <w:color w:val="0563C1"/>
             <w:u w:val="single"/>
           </w:rPr>
-          <w:t>https://github.com/demo/agent-lab</w:t>
+          <w:t>https://github.com/openclaw/openclaw</w:t>
         </w:r>
       </w:hyperlink>
     </w:p>
@@ -1061,13 +1740,13 @@
         </w:rPr>
         <w:t>官方文档：</w:t>
       </w:r>
-      <w:hyperlink r:id="rId15">
+      <w:hyperlink r:id="rId22">
         <w:r>
           <w:rPr>
             <w:color w:val="0563C1"/>
             <w:u w:val="single"/>
           </w:rPr>
-          <w:t>https://example.com/agent-lab/docs</w:t>
+          <w:t>https://openclaw.ai</w:t>
         </w:r>
       </w:hyperlink>
     </w:p>
@@ -1078,13 +1757,13 @@
         </w:rPr>
         <w:t>官方网站：</w:t>
       </w:r>
-      <w:hyperlink r:id="rId16">
+      <w:hyperlink r:id="rId22">
         <w:r>
           <w:rPr>
             <w:color w:val="0563C1"/>
             <w:u w:val="single"/>
           </w:rPr>
-          <w:t>https://example.com/agent-lab</w:t>
+          <w:t>https://openclaw.ai</w:t>
         </w:r>
       </w:hyperlink>
     </w:p>
@@ -1098,7 +1777,7 @@
         <w:pStyle w:val="Heading2"/>
       </w:pPr>
       <w:r>
-        <w:t>3.2 local-llm-kit</w:t>
+        <w:t>3.2 n8n</w:t>
       </w:r>
     </w:p>
     <w:p>
@@ -1114,11 +1793,11 @@
               <a:graphicData uri="http://schemas.openxmlformats.org/drawingml/2006/picture">
                 <pic:pic>
                   <pic:nvPicPr>
-                    <pic:cNvPr id="0" name="demo__local-llm-kit.png"/>
+                    <pic:cNvPr id="0" name="n8n-io__n8n.png"/>
                     <pic:cNvPicPr/>
                   </pic:nvPicPr>
                   <pic:blipFill>
-                    <a:blip r:embed="rId17"/>
+                    <a:blip r:embed="rId23"/>
                     <a:stretch>
                       <a:fillRect/>
                     </a:stretch>
@@ -1173,7 +1852,518 @@
           </w:tcPr>
           <w:p>
             <w:r>
-              <w:t>demo/local-llm-kit</w:t>
+              <w:t>n8n-io/n8n</w:t>
+            </w:r>
+          </w:p>
+        </w:tc>
+      </w:tr>
+      <w:tr>
+        <w:tc>
+          <w:tcPr>
+            <w:tcW w:type="dxa" w:w="2232"/>
+            <w:shd w:fill="EDF3F8"/>
+          </w:tcPr>
+          <w:p>
+            <w:r>
+              <w:t>分类</w:t>
+            </w:r>
+          </w:p>
+        </w:tc>
+        <w:tc>
+          <w:tcPr>
+            <w:tcW w:type="dxa" w:w="7128"/>
+          </w:tcPr>
+          <w:p>
+            <w:r>
+              <w:t>自动化工具</w:t>
+            </w:r>
+          </w:p>
+        </w:tc>
+      </w:tr>
+      <w:tr>
+        <w:tc>
+          <w:tcPr>
+            <w:tcW w:type="dxa" w:w="2232"/>
+            <w:shd w:fill="EDF3F8"/>
+          </w:tcPr>
+          <w:p>
+            <w:r>
+              <w:t>许可证 / 语言</w:t>
+            </w:r>
+          </w:p>
+        </w:tc>
+        <w:tc>
+          <w:tcPr>
+            <w:tcW w:type="dxa" w:w="7128"/>
+          </w:tcPr>
+          <w:p>
+            <w:r>
+              <w:t>NOASSERTION / TypeScript</w:t>
+            </w:r>
+          </w:p>
+        </w:tc>
+      </w:tr>
+      <w:tr>
+        <w:tc>
+          <w:tcPr>
+            <w:tcW w:type="dxa" w:w="2232"/>
+            <w:shd w:fill="EDF3F8"/>
+          </w:tcPr>
+          <w:p>
+            <w:r>
+              <w:t>Star / 周新增 / Fork</w:t>
+            </w:r>
+          </w:p>
+        </w:tc>
+        <w:tc>
+          <w:tcPr>
+            <w:tcW w:type="dxa" w:w="7128"/>
+          </w:tcPr>
+          <w:p>
+            <w:r>
+              <w:t>197,046 / 0 / 59,464</w:t>
+            </w:r>
+          </w:p>
+        </w:tc>
+      </w:tr>
+      <w:tr>
+        <w:tc>
+          <w:tcPr>
+            <w:tcW w:type="dxa" w:w="2232"/>
+            <w:shd w:fill="EDF3F8"/>
+          </w:tcPr>
+          <w:p>
+            <w:r>
+              <w:t>最近更新 / Release</w:t>
+            </w:r>
+          </w:p>
+        </w:tc>
+        <w:tc>
+          <w:tcPr>
+            <w:tcW w:type="dxa" w:w="7128"/>
+          </w:tcPr>
+          <w:p>
+            <w:r>
+              <w:t>2026-07-19 / n8n@2.30.7</w:t>
+            </w:r>
+          </w:p>
+        </w:tc>
+      </w:tr>
+      <w:tr>
+        <w:tc>
+          <w:tcPr>
+            <w:tcW w:type="dxa" w:w="2232"/>
+            <w:shd w:fill="EDF3F8"/>
+          </w:tcPr>
+          <w:p>
+            <w:r>
+              <w:t>平台 / 难度</w:t>
+            </w:r>
+          </w:p>
+        </w:tc>
+        <w:tc>
+          <w:tcPr>
+            <w:tcW w:type="dxa" w:w="7128"/>
+          </w:tcPr>
+          <w:p>
+            <w:r>
+              <w:t>以官方 README 为准，通常支持 Windows、macOS 或 Linux 中的部分平台 / 中等</w:t>
+            </w:r>
+          </w:p>
+        </w:tc>
+      </w:tr>
+    </w:tbl>
+    <w:p>
+      <w:pPr>
+        <w:pStyle w:val="Heading3"/>
+      </w:pPr>
+      <w:r>
+        <w:t>项目介绍</w:t>
+      </w:r>
+    </w:p>
+    <w:p>
+      <w:r>
+        <w:t>n8n 是自动化工具领域项目。Fair-code workflow automation platform with native AI capabilities. Combine visual building with custom code, self-host or cloud, 400+ integrations.</w:t>
+      </w:r>
+    </w:p>
+    <w:p>
+      <w:pPr>
+        <w:pStyle w:val="Heading3"/>
+      </w:pPr>
+      <w:r>
+        <w:t>核心工作原理</w:t>
+      </w:r>
+    </w:p>
+    <w:p>
+      <w:r>
+        <w:t>通过可复用的开源组件、命令行或服务接口完成核心任务；具体架构以官方文档为准。</w:t>
+      </w:r>
+    </w:p>
+    <w:p>
+      <w:pPr>
+        <w:pStyle w:val="Heading3"/>
+      </w:pPr>
+      <w:r>
+        <w:t>为什么本周受到关注</w:t>
+      </w:r>
+    </w:p>
+    <w:p>
+      <w:r>
+        <w:t>近期提交活跃，综合热度得分 56.4；本周新增 Star 0。首次运行时增长数字可能为估算。</w:t>
+      </w:r>
+    </w:p>
+    <w:p>
+      <w:pPr>
+        <w:pStyle w:val="Heading3"/>
+      </w:pPr>
+      <w:r>
+        <w:t>适合人群</w:t>
+      </w:r>
+    </w:p>
+    <w:p>
+      <w:r>
+        <w:t>适合有一定编程基础的用户、专业开发者和评估型团队；零基础用户应优先选择带安装包或图形界面的项目。</w:t>
+      </w:r>
+    </w:p>
+    <w:p>
+      <w:pPr>
+        <w:pStyle w:val="Heading3"/>
+      </w:pPr>
+      <w:r>
+        <w:t>生产环境判断</w:t>
+      </w:r>
+    </w:p>
+    <w:p>
+      <w:r>
+        <w:t>需完成版本锁定、安全审计和压力测试后再决定</w:t>
+      </w:r>
+    </w:p>
+    <w:p>
+      <w:pPr>
+        <w:pStyle w:val="Heading3"/>
+      </w:pPr>
+      <w:r>
+        <w:t>核心功能</w:t>
+      </w:r>
+    </w:p>
+    <w:p>
+      <w:pPr>
+        <w:pStyle w:val="ListBullet"/>
+      </w:pPr>
+      <w:r>
+        <w:t>提供可复用的核心能力和公开源码</w:t>
+      </w:r>
+    </w:p>
+    <w:p>
+      <w:pPr>
+        <w:pStyle w:val="ListBullet"/>
+      </w:pPr>
+      <w:r>
+        <w:t>README 包含安装或使用线索</w:t>
+      </w:r>
+    </w:p>
+    <w:p>
+      <w:pPr>
+        <w:pStyle w:val="ListBullet"/>
+      </w:pPr>
+      <w:r>
+        <w:t>社区可通过 Issue 与 PR 协作</w:t>
+      </w:r>
+    </w:p>
+    <w:p>
+      <w:pPr>
+        <w:pStyle w:val="ListBullet"/>
+      </w:pPr>
+      <w:r>
+        <w:t>支持从最小示例逐步扩展</w:t>
+      </w:r>
+    </w:p>
+    <w:p>
+      <w:pPr>
+        <w:pStyle w:val="Heading3"/>
+      </w:pPr>
+      <w:r>
+        <w:t>实际应用场景</w:t>
+      </w:r>
+    </w:p>
+    <w:p>
+      <w:pPr>
+        <w:pStyle w:val="ListBullet"/>
+      </w:pPr>
+      <w:r>
+        <w:t>学生：用最小示例理解该领域的工程结构</w:t>
+      </w:r>
+    </w:p>
+    <w:p>
+      <w:pPr>
+        <w:pStyle w:val="ListBullet"/>
+      </w:pPr>
+      <w:r>
+        <w:t>程序员：在测试环境验证后集成到个人项目</w:t>
+      </w:r>
+    </w:p>
+    <w:p>
+      <w:pPr>
+        <w:pStyle w:val="ListBullet"/>
+      </w:pPr>
+      <w:r>
+        <w:t>团队：用于原型评估和技术选型对比</w:t>
+      </w:r>
+    </w:p>
+    <w:p>
+      <w:pPr>
+        <w:pStyle w:val="Heading3"/>
+      </w:pPr>
+      <w:r>
+        <w:t>快速上手</w:t>
+      </w:r>
+    </w:p>
+    <w:p>
+      <w:pPr>
+        <w:pStyle w:val="ListNumber"/>
+      </w:pPr>
+      <w:r>
+        <w:t>阅读官方 README 并确认系统要求</w:t>
+      </w:r>
+    </w:p>
+    <w:p>
+      <w:pPr>
+        <w:pStyle w:val="ListNumber"/>
+      </w:pPr>
+      <w:r>
+        <w:t>在隔离环境按官方命令安装</w:t>
+      </w:r>
+    </w:p>
+    <w:p>
+      <w:pPr>
+        <w:pStyle w:val="ListNumber"/>
+      </w:pPr>
+      <w:r>
+        <w:t>运行最小示例或演示项目</w:t>
+      </w:r>
+    </w:p>
+    <w:p>
+      <w:pPr>
+        <w:pStyle w:val="ListNumber"/>
+      </w:pPr>
+      <w:r>
+        <w:t>验证数据、权限和许可证后再扩大使用</w:t>
+      </w:r>
+    </w:p>
+    <w:p>
+      <w:pPr>
+        <w:pStyle w:val="Heading3"/>
+      </w:pPr>
+      <w:r>
+        <w:t>主要优点</w:t>
+      </w:r>
+    </w:p>
+    <w:p>
+      <w:pPr>
+        <w:pStyle w:val="ListBullet"/>
+      </w:pPr>
+      <w:r>
+        <w:t>近期活跃</w:t>
+      </w:r>
+    </w:p>
+    <w:p>
+      <w:pPr>
+        <w:pStyle w:val="ListBullet"/>
+      </w:pPr>
+      <w:r>
+        <w:t>源码透明</w:t>
+      </w:r>
+    </w:p>
+    <w:p>
+      <w:pPr>
+        <w:pStyle w:val="ListBullet"/>
+      </w:pPr>
+      <w:r>
+        <w:t>可从小规模试用</w:t>
+      </w:r>
+    </w:p>
+    <w:p>
+      <w:pPr>
+        <w:pStyle w:val="Heading3"/>
+      </w:pPr>
+      <w:r>
+        <w:t>局限与风险</w:t>
+      </w:r>
+    </w:p>
+    <w:p>
+      <w:pPr>
+        <w:pStyle w:val="ListBullet"/>
+      </w:pPr>
+      <w:r>
+        <w:t>热门不等于稳定</w:t>
+      </w:r>
+    </w:p>
+    <w:p>
+      <w:pPr>
+        <w:pStyle w:val="ListBullet"/>
+      </w:pPr>
+      <w:r>
+        <w:t>安装方式可能随版本变化</w:t>
+      </w:r>
+    </w:p>
+    <w:p>
+      <w:pPr>
+        <w:pStyle w:val="ListBullet"/>
+      </w:pPr>
+      <w:r>
+        <w:t>生产使用前需要安全审计</w:t>
+      </w:r>
+    </w:p>
+    <w:p>
+      <w:pPr>
+        <w:pStyle w:val="Heading3"/>
+      </w:pPr>
+      <w:r>
+        <w:t>评分与推荐理由</w:t>
+      </w:r>
+    </w:p>
+    <w:p>
+      <w:r>
+        <w:t>热度 2.8/5；实用性 4.0/5；创新性 3.8/5；易用性 3.2/5；项目成熟度 5.0/5；推荐指数 2.8/5。综合热度算法得分 56.4/100。</w:t>
+      </w:r>
+    </w:p>
+    <w:p>
+      <w:r>
+        <w:rPr>
+          <w:b/>
+        </w:rPr>
+        <w:t>项目地址：</w:t>
+      </w:r>
+      <w:hyperlink r:id="rId12">
+        <w:r>
+          <w:rPr>
+            <w:color w:val="0563C1"/>
+            <w:u w:val="single"/>
+          </w:rPr>
+          <w:t>https://github.com/n8n-io/n8n</w:t>
+        </w:r>
+      </w:hyperlink>
+    </w:p>
+    <w:p>
+      <w:r>
+        <w:rPr>
+          <w:b/>
+        </w:rPr>
+        <w:t>官方文档：</w:t>
+      </w:r>
+      <w:hyperlink r:id="rId24">
+        <w:r>
+          <w:rPr>
+            <w:color w:val="0563C1"/>
+            <w:u w:val="single"/>
+          </w:rPr>
+          <w:t>https://n8n.io</w:t>
+        </w:r>
+      </w:hyperlink>
+    </w:p>
+    <w:p>
+      <w:r>
+        <w:rPr>
+          <w:b/>
+        </w:rPr>
+        <w:t>官方网站：</w:t>
+      </w:r>
+      <w:hyperlink r:id="rId24">
+        <w:r>
+          <w:rPr>
+            <w:color w:val="0563C1"/>
+            <w:u w:val="single"/>
+          </w:rPr>
+          <w:t>https://n8n.io</w:t>
+        </w:r>
+      </w:hyperlink>
+    </w:p>
+    <w:p>
+      <w:r>
+        <w:br w:type="page"/>
+      </w:r>
+    </w:p>
+    <w:p>
+      <w:pPr>
+        <w:pStyle w:val="Heading2"/>
+      </w:pPr>
+      <w:r>
+        <w:t>3.3 ollama</w:t>
+      </w:r>
+    </w:p>
+    <w:p>
+      <w:r>
+        <w:drawing>
+          <wp:inline xmlns:a="http://schemas.openxmlformats.org/drawingml/2006/main" xmlns:pic="http://schemas.openxmlformats.org/drawingml/2006/picture">
+            <wp:extent cx="5760720" cy="3240405"/>
+            <wp:docPr id="4" name="Picture 4"/>
+            <wp:cNvGraphicFramePr>
+              <a:graphicFrameLocks noChangeAspect="1"/>
+            </wp:cNvGraphicFramePr>
+            <a:graphic>
+              <a:graphicData uri="http://schemas.openxmlformats.org/drawingml/2006/picture">
+                <pic:pic>
+                  <pic:nvPicPr>
+                    <pic:cNvPr id="0" name="ollama__ollama.png"/>
+                    <pic:cNvPicPr/>
+                  </pic:nvPicPr>
+                  <pic:blipFill>
+                    <a:blip r:embed="rId25"/>
+                    <a:stretch>
+                      <a:fillRect/>
+                    </a:stretch>
+                  </pic:blipFill>
+                  <pic:spPr>
+                    <a:xfrm>
+                      <a:off x="0" y="0"/>
+                      <a:ext cx="5760720" cy="3240405"/>
+                    </a:xfrm>
+                    <a:prstGeom prst="rect"/>
+                  </pic:spPr>
+                </pic:pic>
+              </a:graphicData>
+            </a:graphic>
+          </wp:inline>
+        </w:drawing>
+      </w:r>
+    </w:p>
+    <w:p>
+      <w:pPr>
+        <w:jc w:val="center"/>
+      </w:pPr>
+      <w:r>
+        <w:t>非官方示意信息图</w:t>
+      </w:r>
+    </w:p>
+    <w:tbl>
+      <w:tblPr>
+        <w:tblW w:type="auto" w:w="0"/>
+        <w:tblLayout w:type="fixed"/>
+        <w:tblLook w:firstColumn="1" w:firstRow="1" w:lastColumn="0" w:lastRow="0" w:noHBand="0" w:noVBand="1" w:val="04A0"/>
+      </w:tblPr>
+      <w:tblGrid>
+        <w:gridCol w:w="4680"/>
+        <w:gridCol w:w="4680"/>
+      </w:tblGrid>
+      <w:tr>
+        <w:tc>
+          <w:tcPr>
+            <w:tcW w:type="dxa" w:w="2232"/>
+            <w:shd w:fill="EDF3F8"/>
+          </w:tcPr>
+          <w:p>
+            <w:r>
+              <w:t>仓库</w:t>
+            </w:r>
+          </w:p>
+        </w:tc>
+        <w:tc>
+          <w:tcPr>
+            <w:tcW w:type="dxa" w:w="7128"/>
+          </w:tcPr>
+          <w:p>
+            <w:r>
+              <w:t>ollama/ollama</w:t>
             </w:r>
           </w:p>
         </w:tc>
@@ -1219,7 +2409,7 @@
           </w:tcPr>
           <w:p>
             <w:r>
-              <w:t>MIT / Python</w:t>
+              <w:t>MIT / Go</w:t>
             </w:r>
           </w:p>
         </w:tc>
@@ -1242,7 +2432,2051 @@
           </w:tcPr>
           <w:p>
             <w:r>
-              <w:t>28,200 / 0 / 2,080</w:t>
+              <w:t>176,447 / 0 / 17,029</w:t>
+            </w:r>
+          </w:p>
+        </w:tc>
+      </w:tr>
+      <w:tr>
+        <w:tc>
+          <w:tcPr>
+            <w:tcW w:type="dxa" w:w="2232"/>
+            <w:shd w:fill="EDF3F8"/>
+          </w:tcPr>
+          <w:p>
+            <w:r>
+              <w:t>最近更新 / Release</w:t>
+            </w:r>
+          </w:p>
+        </w:tc>
+        <w:tc>
+          <w:tcPr>
+            <w:tcW w:type="dxa" w:w="7128"/>
+          </w:tcPr>
+          <w:p>
+            <w:r>
+              <w:t>2026-07-19 / v0.32.1</w:t>
+            </w:r>
+          </w:p>
+        </w:tc>
+      </w:tr>
+      <w:tr>
+        <w:tc>
+          <w:tcPr>
+            <w:tcW w:type="dxa" w:w="2232"/>
+            <w:shd w:fill="EDF3F8"/>
+          </w:tcPr>
+          <w:p>
+            <w:r>
+              <w:t>平台 / 难度</w:t>
+            </w:r>
+          </w:p>
+        </w:tc>
+        <w:tc>
+          <w:tcPr>
+            <w:tcW w:type="dxa" w:w="7128"/>
+          </w:tcPr>
+          <w:p>
+            <w:r>
+              <w:t>以官方 README 为准，通常支持 Windows、macOS 或 Linux 中的部分平台 / 中等</w:t>
+            </w:r>
+          </w:p>
+        </w:tc>
+      </w:tr>
+    </w:tbl>
+    <w:p>
+      <w:pPr>
+        <w:pStyle w:val="Heading3"/>
+      </w:pPr>
+      <w:r>
+        <w:t>项目介绍</w:t>
+      </w:r>
+    </w:p>
+    <w:p>
+      <w:r>
+        <w:t>ollama 是人工智能与大模型领域项目。Get up and running with Kimi-K2.6, GLM-5.2, MiniMax, DeepSeek, gpt-oss, Qwen, Gemma and other models.</w:t>
+      </w:r>
+    </w:p>
+    <w:p>
+      <w:pPr>
+        <w:pStyle w:val="Heading3"/>
+      </w:pPr>
+      <w:r>
+        <w:t>核心工作原理</w:t>
+      </w:r>
+    </w:p>
+    <w:p>
+      <w:r>
+        <w:t>通过可复用的开源组件、命令行或服务接口完成核心任务；具体架构以官方文档为准。</w:t>
+      </w:r>
+    </w:p>
+    <w:p>
+      <w:pPr>
+        <w:pStyle w:val="Heading3"/>
+      </w:pPr>
+      <w:r>
+        <w:t>为什么本周受到关注</w:t>
+      </w:r>
+    </w:p>
+    <w:p>
+      <w:r>
+        <w:t>近期提交活跃，综合热度得分 55.8；本周新增 Star 0。首次运行时增长数字可能为估算。</w:t>
+      </w:r>
+    </w:p>
+    <w:p>
+      <w:pPr>
+        <w:pStyle w:val="Heading3"/>
+      </w:pPr>
+      <w:r>
+        <w:t>适合人群</w:t>
+      </w:r>
+    </w:p>
+    <w:p>
+      <w:r>
+        <w:t>适合有一定编程基础的用户、专业开发者和评估型团队；零基础用户应优先选择带安装包或图形界面的项目。</w:t>
+      </w:r>
+    </w:p>
+    <w:p>
+      <w:pPr>
+        <w:pStyle w:val="Heading3"/>
+      </w:pPr>
+      <w:r>
+        <w:t>生产环境判断</w:t>
+      </w:r>
+    </w:p>
+    <w:p>
+      <w:r>
+        <w:t>需完成版本锁定、安全审计和压力测试后再决定</w:t>
+      </w:r>
+    </w:p>
+    <w:p>
+      <w:pPr>
+        <w:pStyle w:val="Heading3"/>
+      </w:pPr>
+      <w:r>
+        <w:t>核心功能</w:t>
+      </w:r>
+    </w:p>
+    <w:p>
+      <w:pPr>
+        <w:pStyle w:val="ListBullet"/>
+      </w:pPr>
+      <w:r>
+        <w:t>提供可复用的核心能力和公开源码</w:t>
+      </w:r>
+    </w:p>
+    <w:p>
+      <w:pPr>
+        <w:pStyle w:val="ListBullet"/>
+      </w:pPr>
+      <w:r>
+        <w:t>README 包含安装或使用线索</w:t>
+      </w:r>
+    </w:p>
+    <w:p>
+      <w:pPr>
+        <w:pStyle w:val="ListBullet"/>
+      </w:pPr>
+      <w:r>
+        <w:t>社区可通过 Issue 与 PR 协作</w:t>
+      </w:r>
+    </w:p>
+    <w:p>
+      <w:pPr>
+        <w:pStyle w:val="ListBullet"/>
+      </w:pPr>
+      <w:r>
+        <w:t>支持从最小示例逐步扩展</w:t>
+      </w:r>
+    </w:p>
+    <w:p>
+      <w:pPr>
+        <w:pStyle w:val="Heading3"/>
+      </w:pPr>
+      <w:r>
+        <w:t>实际应用场景</w:t>
+      </w:r>
+    </w:p>
+    <w:p>
+      <w:pPr>
+        <w:pStyle w:val="ListBullet"/>
+      </w:pPr>
+      <w:r>
+        <w:t>学生：用最小示例理解该领域的工程结构</w:t>
+      </w:r>
+    </w:p>
+    <w:p>
+      <w:pPr>
+        <w:pStyle w:val="ListBullet"/>
+      </w:pPr>
+      <w:r>
+        <w:t>程序员：在测试环境验证后集成到个人项目</w:t>
+      </w:r>
+    </w:p>
+    <w:p>
+      <w:pPr>
+        <w:pStyle w:val="ListBullet"/>
+      </w:pPr>
+      <w:r>
+        <w:t>团队：用于原型评估和技术选型对比</w:t>
+      </w:r>
+    </w:p>
+    <w:p>
+      <w:pPr>
+        <w:pStyle w:val="Heading3"/>
+      </w:pPr>
+      <w:r>
+        <w:t>快速上手</w:t>
+      </w:r>
+    </w:p>
+    <w:p>
+      <w:pPr>
+        <w:pStyle w:val="ListNumber"/>
+      </w:pPr>
+      <w:r>
+        <w:t>阅读官方 README 并确认系统要求</w:t>
+      </w:r>
+    </w:p>
+    <w:p>
+      <w:pPr>
+        <w:pStyle w:val="ListNumber"/>
+      </w:pPr>
+      <w:r>
+        <w:t>在隔离环境按官方命令安装</w:t>
+      </w:r>
+    </w:p>
+    <w:p>
+      <w:pPr>
+        <w:pStyle w:val="ListNumber"/>
+      </w:pPr>
+      <w:r>
+        <w:t>运行最小示例或演示项目</w:t>
+      </w:r>
+    </w:p>
+    <w:p>
+      <w:pPr>
+        <w:pStyle w:val="ListNumber"/>
+      </w:pPr>
+      <w:r>
+        <w:t>验证数据、权限和许可证后再扩大使用</w:t>
+      </w:r>
+    </w:p>
+    <w:p>
+      <w:pPr>
+        <w:pStyle w:val="Heading3"/>
+      </w:pPr>
+      <w:r>
+        <w:t>主要优点</w:t>
+      </w:r>
+    </w:p>
+    <w:p>
+      <w:pPr>
+        <w:pStyle w:val="ListBullet"/>
+      </w:pPr>
+      <w:r>
+        <w:t>近期活跃</w:t>
+      </w:r>
+    </w:p>
+    <w:p>
+      <w:pPr>
+        <w:pStyle w:val="ListBullet"/>
+      </w:pPr>
+      <w:r>
+        <w:t>源码透明</w:t>
+      </w:r>
+    </w:p>
+    <w:p>
+      <w:pPr>
+        <w:pStyle w:val="ListBullet"/>
+      </w:pPr>
+      <w:r>
+        <w:t>可从小规模试用</w:t>
+      </w:r>
+    </w:p>
+    <w:p>
+      <w:pPr>
+        <w:pStyle w:val="Heading3"/>
+      </w:pPr>
+      <w:r>
+        <w:t>局限与风险</w:t>
+      </w:r>
+    </w:p>
+    <w:p>
+      <w:pPr>
+        <w:pStyle w:val="ListBullet"/>
+      </w:pPr>
+      <w:r>
+        <w:t>热门不等于稳定</w:t>
+      </w:r>
+    </w:p>
+    <w:p>
+      <w:pPr>
+        <w:pStyle w:val="ListBullet"/>
+      </w:pPr>
+      <w:r>
+        <w:t>安装方式可能随版本变化</w:t>
+      </w:r>
+    </w:p>
+    <w:p>
+      <w:pPr>
+        <w:pStyle w:val="ListBullet"/>
+      </w:pPr>
+      <w:r>
+        <w:t>生产使用前需要安全审计</w:t>
+      </w:r>
+    </w:p>
+    <w:p>
+      <w:pPr>
+        <w:pStyle w:val="Heading3"/>
+      </w:pPr>
+      <w:r>
+        <w:t>评分与推荐理由</w:t>
+      </w:r>
+    </w:p>
+    <w:p>
+      <w:r>
+        <w:t>热度 2.8/5；实用性 4.0/5；创新性 3.8/5；易用性 3.2/5；项目成熟度 5.0/5；推荐指数 2.8/5。综合热度算法得分 55.8/100。</w:t>
+      </w:r>
+    </w:p>
+    <w:p>
+      <w:r>
+        <w:rPr>
+          <w:b/>
+        </w:rPr>
+        <w:t>项目地址：</w:t>
+      </w:r>
+      <w:hyperlink r:id="rId13">
+        <w:r>
+          <w:rPr>
+            <w:color w:val="0563C1"/>
+            <w:u w:val="single"/>
+          </w:rPr>
+          <w:t>https://github.com/ollama/ollama</w:t>
+        </w:r>
+      </w:hyperlink>
+    </w:p>
+    <w:p>
+      <w:r>
+        <w:rPr>
+          <w:b/>
+        </w:rPr>
+        <w:t>官方文档：</w:t>
+      </w:r>
+      <w:hyperlink r:id="rId26">
+        <w:r>
+          <w:rPr>
+            <w:color w:val="0563C1"/>
+            <w:u w:val="single"/>
+          </w:rPr>
+          <w:t>https://ollama.com</w:t>
+        </w:r>
+      </w:hyperlink>
+    </w:p>
+    <w:p>
+      <w:r>
+        <w:rPr>
+          <w:b/>
+        </w:rPr>
+        <w:t>官方网站：</w:t>
+      </w:r>
+      <w:hyperlink r:id="rId26">
+        <w:r>
+          <w:rPr>
+            <w:color w:val="0563C1"/>
+            <w:u w:val="single"/>
+          </w:rPr>
+          <w:t>https://ollama.com</w:t>
+        </w:r>
+      </w:hyperlink>
+    </w:p>
+    <w:p>
+      <w:r>
+        <w:br w:type="page"/>
+      </w:r>
+    </w:p>
+    <w:p>
+      <w:pPr>
+        <w:pStyle w:val="Heading2"/>
+      </w:pPr>
+      <w:r>
+        <w:t>3.4 AutoGPT</w:t>
+      </w:r>
+    </w:p>
+    <w:p>
+      <w:r>
+        <w:drawing>
+          <wp:inline xmlns:a="http://schemas.openxmlformats.org/drawingml/2006/main" xmlns:pic="http://schemas.openxmlformats.org/drawingml/2006/picture">
+            <wp:extent cx="5760720" cy="3240405"/>
+            <wp:docPr id="5" name="Picture 5"/>
+            <wp:cNvGraphicFramePr>
+              <a:graphicFrameLocks noChangeAspect="1"/>
+            </wp:cNvGraphicFramePr>
+            <a:graphic>
+              <a:graphicData uri="http://schemas.openxmlformats.org/drawingml/2006/picture">
+                <pic:pic>
+                  <pic:nvPicPr>
+                    <pic:cNvPr id="0" name="Significant-Gravitas__AutoGPT.png"/>
+                    <pic:cNvPicPr/>
+                  </pic:nvPicPr>
+                  <pic:blipFill>
+                    <a:blip r:embed="rId27"/>
+                    <a:stretch>
+                      <a:fillRect/>
+                    </a:stretch>
+                  </pic:blipFill>
+                  <pic:spPr>
+                    <a:xfrm>
+                      <a:off x="0" y="0"/>
+                      <a:ext cx="5760720" cy="3240405"/>
+                    </a:xfrm>
+                    <a:prstGeom prst="rect"/>
+                  </pic:spPr>
+                </pic:pic>
+              </a:graphicData>
+            </a:graphic>
+          </wp:inline>
+        </w:drawing>
+      </w:r>
+    </w:p>
+    <w:p>
+      <w:pPr>
+        <w:jc w:val="center"/>
+      </w:pPr>
+      <w:r>
+        <w:t>非官方示意信息图</w:t>
+      </w:r>
+    </w:p>
+    <w:tbl>
+      <w:tblPr>
+        <w:tblW w:type="auto" w:w="0"/>
+        <w:tblLayout w:type="fixed"/>
+        <w:tblLook w:firstColumn="1" w:firstRow="1" w:lastColumn="0" w:lastRow="0" w:noHBand="0" w:noVBand="1" w:val="04A0"/>
+      </w:tblPr>
+      <w:tblGrid>
+        <w:gridCol w:w="4680"/>
+        <w:gridCol w:w="4680"/>
+      </w:tblGrid>
+      <w:tr>
+        <w:tc>
+          <w:tcPr>
+            <w:tcW w:type="dxa" w:w="2232"/>
+            <w:shd w:fill="EDF3F8"/>
+          </w:tcPr>
+          <w:p>
+            <w:r>
+              <w:t>仓库</w:t>
+            </w:r>
+          </w:p>
+        </w:tc>
+        <w:tc>
+          <w:tcPr>
+            <w:tcW w:type="dxa" w:w="7128"/>
+          </w:tcPr>
+          <w:p>
+            <w:r>
+              <w:t>Significant-Gravitas/AutoGPT</w:t>
+            </w:r>
+          </w:p>
+        </w:tc>
+      </w:tr>
+      <w:tr>
+        <w:tc>
+          <w:tcPr>
+            <w:tcW w:type="dxa" w:w="2232"/>
+            <w:shd w:fill="EDF3F8"/>
+          </w:tcPr>
+          <w:p>
+            <w:r>
+              <w:t>分类</w:t>
+            </w:r>
+          </w:p>
+        </w:tc>
+        <w:tc>
+          <w:tcPr>
+            <w:tcW w:type="dxa" w:w="7128"/>
+          </w:tcPr>
+          <w:p>
+            <w:r>
+              <w:t>人工智能与大模型</w:t>
+            </w:r>
+          </w:p>
+        </w:tc>
+      </w:tr>
+      <w:tr>
+        <w:tc>
+          <w:tcPr>
+            <w:tcW w:type="dxa" w:w="2232"/>
+            <w:shd w:fill="EDF3F8"/>
+          </w:tcPr>
+          <w:p>
+            <w:r>
+              <w:t>许可证 / 语言</w:t>
+            </w:r>
+          </w:p>
+        </w:tc>
+        <w:tc>
+          <w:tcPr>
+            <w:tcW w:type="dxa" w:w="7128"/>
+          </w:tcPr>
+          <w:p>
+            <w:r>
+              <w:t>NOASSERTION / Python</w:t>
+            </w:r>
+          </w:p>
+        </w:tc>
+      </w:tr>
+      <w:tr>
+        <w:tc>
+          <w:tcPr>
+            <w:tcW w:type="dxa" w:w="2232"/>
+            <w:shd w:fill="EDF3F8"/>
+          </w:tcPr>
+          <w:p>
+            <w:r>
+              <w:t>Star / 周新增 / Fork</w:t>
+            </w:r>
+          </w:p>
+        </w:tc>
+        <w:tc>
+          <w:tcPr>
+            <w:tcW w:type="dxa" w:w="7128"/>
+          </w:tcPr>
+          <w:p>
+            <w:r>
+              <w:t>185,611 / 0 / 46,072</w:t>
+            </w:r>
+          </w:p>
+        </w:tc>
+      </w:tr>
+      <w:tr>
+        <w:tc>
+          <w:tcPr>
+            <w:tcW w:type="dxa" w:w="2232"/>
+            <w:shd w:fill="EDF3F8"/>
+          </w:tcPr>
+          <w:p>
+            <w:r>
+              <w:t>最近更新 / Release</w:t>
+            </w:r>
+          </w:p>
+        </w:tc>
+        <w:tc>
+          <w:tcPr>
+            <w:tcW w:type="dxa" w:w="7128"/>
+          </w:tcPr>
+          <w:p>
+            <w:r>
+              <w:t>2026-07-19 / autogpt-platform-beta-v0.6.68</w:t>
+            </w:r>
+          </w:p>
+        </w:tc>
+      </w:tr>
+      <w:tr>
+        <w:tc>
+          <w:tcPr>
+            <w:tcW w:type="dxa" w:w="2232"/>
+            <w:shd w:fill="EDF3F8"/>
+          </w:tcPr>
+          <w:p>
+            <w:r>
+              <w:t>平台 / 难度</w:t>
+            </w:r>
+          </w:p>
+        </w:tc>
+        <w:tc>
+          <w:tcPr>
+            <w:tcW w:type="dxa" w:w="7128"/>
+          </w:tcPr>
+          <w:p>
+            <w:r>
+              <w:t>以官方 README 为准，通常支持 Windows、macOS 或 Linux 中的部分平台 / 中等</w:t>
+            </w:r>
+          </w:p>
+        </w:tc>
+      </w:tr>
+    </w:tbl>
+    <w:p>
+      <w:pPr>
+        <w:pStyle w:val="Heading3"/>
+      </w:pPr>
+      <w:r>
+        <w:t>项目介绍</w:t>
+      </w:r>
+    </w:p>
+    <w:p>
+      <w:r>
+        <w:t>AutoGPT 是人工智能与大模型领域项目。AutoGPT is the vision of accessible AI for everyone, to use and to build on. Our mission is to provide the tools, so that you can focus on what matters.</w:t>
+      </w:r>
+    </w:p>
+    <w:p>
+      <w:pPr>
+        <w:pStyle w:val="Heading3"/>
+      </w:pPr>
+      <w:r>
+        <w:t>核心工作原理</w:t>
+      </w:r>
+    </w:p>
+    <w:p>
+      <w:r>
+        <w:t>通过可复用的开源组件、命令行或服务接口完成核心任务；具体架构以官方文档为准。</w:t>
+      </w:r>
+    </w:p>
+    <w:p>
+      <w:pPr>
+        <w:pStyle w:val="Heading3"/>
+      </w:pPr>
+      <w:r>
+        <w:t>为什么本周受到关注</w:t>
+      </w:r>
+    </w:p>
+    <w:p>
+      <w:r>
+        <w:t>近期提交活跃，综合热度得分 55.4；本周新增 Star 0。首次运行时增长数字可能为估算。</w:t>
+      </w:r>
+    </w:p>
+    <w:p>
+      <w:pPr>
+        <w:pStyle w:val="Heading3"/>
+      </w:pPr>
+      <w:r>
+        <w:t>适合人群</w:t>
+      </w:r>
+    </w:p>
+    <w:p>
+      <w:r>
+        <w:t>适合有一定编程基础的用户、专业开发者和评估型团队；零基础用户应优先选择带安装包或图形界面的项目。</w:t>
+      </w:r>
+    </w:p>
+    <w:p>
+      <w:pPr>
+        <w:pStyle w:val="Heading3"/>
+      </w:pPr>
+      <w:r>
+        <w:t>生产环境判断</w:t>
+      </w:r>
+    </w:p>
+    <w:p>
+      <w:r>
+        <w:t>需完成版本锁定、安全审计和压力测试后再决定</w:t>
+      </w:r>
+    </w:p>
+    <w:p>
+      <w:pPr>
+        <w:pStyle w:val="Heading3"/>
+      </w:pPr>
+      <w:r>
+        <w:t>核心功能</w:t>
+      </w:r>
+    </w:p>
+    <w:p>
+      <w:pPr>
+        <w:pStyle w:val="ListBullet"/>
+      </w:pPr>
+      <w:r>
+        <w:t>提供可复用的核心能力和公开源码</w:t>
+      </w:r>
+    </w:p>
+    <w:p>
+      <w:pPr>
+        <w:pStyle w:val="ListBullet"/>
+      </w:pPr>
+      <w:r>
+        <w:t>README 包含安装或使用线索</w:t>
+      </w:r>
+    </w:p>
+    <w:p>
+      <w:pPr>
+        <w:pStyle w:val="ListBullet"/>
+      </w:pPr>
+      <w:r>
+        <w:t>社区可通过 Issue 与 PR 协作</w:t>
+      </w:r>
+    </w:p>
+    <w:p>
+      <w:pPr>
+        <w:pStyle w:val="ListBullet"/>
+      </w:pPr>
+      <w:r>
+        <w:t>支持从最小示例逐步扩展</w:t>
+      </w:r>
+    </w:p>
+    <w:p>
+      <w:pPr>
+        <w:pStyle w:val="Heading3"/>
+      </w:pPr>
+      <w:r>
+        <w:t>实际应用场景</w:t>
+      </w:r>
+    </w:p>
+    <w:p>
+      <w:pPr>
+        <w:pStyle w:val="ListBullet"/>
+      </w:pPr>
+      <w:r>
+        <w:t>学生：用最小示例理解该领域的工程结构</w:t>
+      </w:r>
+    </w:p>
+    <w:p>
+      <w:pPr>
+        <w:pStyle w:val="ListBullet"/>
+      </w:pPr>
+      <w:r>
+        <w:t>程序员：在测试环境验证后集成到个人项目</w:t>
+      </w:r>
+    </w:p>
+    <w:p>
+      <w:pPr>
+        <w:pStyle w:val="ListBullet"/>
+      </w:pPr>
+      <w:r>
+        <w:t>团队：用于原型评估和技术选型对比</w:t>
+      </w:r>
+    </w:p>
+    <w:p>
+      <w:pPr>
+        <w:pStyle w:val="Heading3"/>
+      </w:pPr>
+      <w:r>
+        <w:t>快速上手</w:t>
+      </w:r>
+    </w:p>
+    <w:p>
+      <w:pPr>
+        <w:pStyle w:val="ListNumber"/>
+      </w:pPr>
+      <w:r>
+        <w:t>阅读官方 README 并确认系统要求</w:t>
+      </w:r>
+    </w:p>
+    <w:p>
+      <w:pPr>
+        <w:pStyle w:val="ListNumber"/>
+      </w:pPr>
+      <w:r>
+        <w:t>在隔离环境按官方命令安装</w:t>
+      </w:r>
+    </w:p>
+    <w:p>
+      <w:pPr>
+        <w:pStyle w:val="ListNumber"/>
+      </w:pPr>
+      <w:r>
+        <w:t>运行最小示例或演示项目</w:t>
+      </w:r>
+    </w:p>
+    <w:p>
+      <w:pPr>
+        <w:pStyle w:val="ListNumber"/>
+      </w:pPr>
+      <w:r>
+        <w:t>验证数据、权限和许可证后再扩大使用</w:t>
+      </w:r>
+    </w:p>
+    <w:p>
+      <w:pPr>
+        <w:pStyle w:val="Heading3"/>
+      </w:pPr>
+      <w:r>
+        <w:t>主要优点</w:t>
+      </w:r>
+    </w:p>
+    <w:p>
+      <w:pPr>
+        <w:pStyle w:val="ListBullet"/>
+      </w:pPr>
+      <w:r>
+        <w:t>近期活跃</w:t>
+      </w:r>
+    </w:p>
+    <w:p>
+      <w:pPr>
+        <w:pStyle w:val="ListBullet"/>
+      </w:pPr>
+      <w:r>
+        <w:t>源码透明</w:t>
+      </w:r>
+    </w:p>
+    <w:p>
+      <w:pPr>
+        <w:pStyle w:val="ListBullet"/>
+      </w:pPr>
+      <w:r>
+        <w:t>可从小规模试用</w:t>
+      </w:r>
+    </w:p>
+    <w:p>
+      <w:pPr>
+        <w:pStyle w:val="Heading3"/>
+      </w:pPr>
+      <w:r>
+        <w:t>局限与风险</w:t>
+      </w:r>
+    </w:p>
+    <w:p>
+      <w:pPr>
+        <w:pStyle w:val="ListBullet"/>
+      </w:pPr>
+      <w:r>
+        <w:t>热门不等于稳定</w:t>
+      </w:r>
+    </w:p>
+    <w:p>
+      <w:pPr>
+        <w:pStyle w:val="ListBullet"/>
+      </w:pPr>
+      <w:r>
+        <w:t>安装方式可能随版本变化</w:t>
+      </w:r>
+    </w:p>
+    <w:p>
+      <w:pPr>
+        <w:pStyle w:val="ListBullet"/>
+      </w:pPr>
+      <w:r>
+        <w:t>生产使用前需要安全审计</w:t>
+      </w:r>
+    </w:p>
+    <w:p>
+      <w:pPr>
+        <w:pStyle w:val="Heading3"/>
+      </w:pPr>
+      <w:r>
+        <w:t>评分与推荐理由</w:t>
+      </w:r>
+    </w:p>
+    <w:p>
+      <w:r>
+        <w:t>热度 2.8/5；实用性 4.0/5；创新性 3.8/5；易用性 3.2/5；项目成熟度 5.0/5；推荐指数 2.8/5。综合热度算法得分 55.4/100。</w:t>
+      </w:r>
+    </w:p>
+    <w:p>
+      <w:r>
+        <w:rPr>
+          <w:b/>
+        </w:rPr>
+        <w:t>项目地址：</w:t>
+      </w:r>
+      <w:hyperlink r:id="rId14">
+        <w:r>
+          <w:rPr>
+            <w:color w:val="0563C1"/>
+            <w:u w:val="single"/>
+          </w:rPr>
+          <w:t>https://github.com/Significant-Gravitas/AutoGPT</w:t>
+        </w:r>
+      </w:hyperlink>
+    </w:p>
+    <w:p>
+      <w:r>
+        <w:rPr>
+          <w:b/>
+        </w:rPr>
+        <w:t>官方文档：</w:t>
+      </w:r>
+      <w:hyperlink r:id="rId28">
+        <w:r>
+          <w:rPr>
+            <w:color w:val="0563C1"/>
+            <w:u w:val="single"/>
+          </w:rPr>
+          <w:t>https://agpt.co</w:t>
+        </w:r>
+      </w:hyperlink>
+    </w:p>
+    <w:p>
+      <w:r>
+        <w:rPr>
+          <w:b/>
+        </w:rPr>
+        <w:t>官方网站：</w:t>
+      </w:r>
+      <w:hyperlink r:id="rId28">
+        <w:r>
+          <w:rPr>
+            <w:color w:val="0563C1"/>
+            <w:u w:val="single"/>
+          </w:rPr>
+          <w:t>https://agpt.co</w:t>
+        </w:r>
+      </w:hyperlink>
+    </w:p>
+    <w:p>
+      <w:r>
+        <w:br w:type="page"/>
+      </w:r>
+    </w:p>
+    <w:p>
+      <w:pPr>
+        <w:pStyle w:val="Heading2"/>
+      </w:pPr>
+      <w:r>
+        <w:t>3.5 opencode</w:t>
+      </w:r>
+    </w:p>
+    <w:p>
+      <w:r>
+        <w:drawing>
+          <wp:inline xmlns:a="http://schemas.openxmlformats.org/drawingml/2006/main" xmlns:pic="http://schemas.openxmlformats.org/drawingml/2006/picture">
+            <wp:extent cx="5760720" cy="3240405"/>
+            <wp:docPr id="6" name="Picture 6"/>
+            <wp:cNvGraphicFramePr>
+              <a:graphicFrameLocks noChangeAspect="1"/>
+            </wp:cNvGraphicFramePr>
+            <a:graphic>
+              <a:graphicData uri="http://schemas.openxmlformats.org/drawingml/2006/picture">
+                <pic:pic>
+                  <pic:nvPicPr>
+                    <pic:cNvPr id="0" name="anomalyco__opencode.png"/>
+                    <pic:cNvPicPr/>
+                  </pic:nvPicPr>
+                  <pic:blipFill>
+                    <a:blip r:embed="rId29"/>
+                    <a:stretch>
+                      <a:fillRect/>
+                    </a:stretch>
+                  </pic:blipFill>
+                  <pic:spPr>
+                    <a:xfrm>
+                      <a:off x="0" y="0"/>
+                      <a:ext cx="5760720" cy="3240405"/>
+                    </a:xfrm>
+                    <a:prstGeom prst="rect"/>
+                  </pic:spPr>
+                </pic:pic>
+              </a:graphicData>
+            </a:graphic>
+          </wp:inline>
+        </w:drawing>
+      </w:r>
+    </w:p>
+    <w:p>
+      <w:pPr>
+        <w:jc w:val="center"/>
+      </w:pPr>
+      <w:r>
+        <w:t>非官方示意信息图</w:t>
+      </w:r>
+    </w:p>
+    <w:tbl>
+      <w:tblPr>
+        <w:tblW w:type="auto" w:w="0"/>
+        <w:tblLayout w:type="fixed"/>
+        <w:tblLook w:firstColumn="1" w:firstRow="1" w:lastColumn="0" w:lastRow="0" w:noHBand="0" w:noVBand="1" w:val="04A0"/>
+      </w:tblPr>
+      <w:tblGrid>
+        <w:gridCol w:w="4680"/>
+        <w:gridCol w:w="4680"/>
+      </w:tblGrid>
+      <w:tr>
+        <w:tc>
+          <w:tcPr>
+            <w:tcW w:type="dxa" w:w="2232"/>
+            <w:shd w:fill="EDF3F8"/>
+          </w:tcPr>
+          <w:p>
+            <w:r>
+              <w:t>仓库</w:t>
+            </w:r>
+          </w:p>
+        </w:tc>
+        <w:tc>
+          <w:tcPr>
+            <w:tcW w:type="dxa" w:w="7128"/>
+          </w:tcPr>
+          <w:p>
+            <w:r>
+              <w:t>anomalyco/opencode</w:t>
+            </w:r>
+          </w:p>
+        </w:tc>
+      </w:tr>
+      <w:tr>
+        <w:tc>
+          <w:tcPr>
+            <w:tcW w:type="dxa" w:w="2232"/>
+            <w:shd w:fill="EDF3F8"/>
+          </w:tcPr>
+          <w:p>
+            <w:r>
+              <w:t>分类</w:t>
+            </w:r>
+          </w:p>
+        </w:tc>
+        <w:tc>
+          <w:tcPr>
+            <w:tcW w:type="dxa" w:w="7128"/>
+          </w:tcPr>
+          <w:p>
+            <w:r>
+              <w:t>AI Agent</w:t>
+            </w:r>
+          </w:p>
+        </w:tc>
+      </w:tr>
+      <w:tr>
+        <w:tc>
+          <w:tcPr>
+            <w:tcW w:type="dxa" w:w="2232"/>
+            <w:shd w:fill="EDF3F8"/>
+          </w:tcPr>
+          <w:p>
+            <w:r>
+              <w:t>许可证 / 语言</w:t>
+            </w:r>
+          </w:p>
+        </w:tc>
+        <w:tc>
+          <w:tcPr>
+            <w:tcW w:type="dxa" w:w="7128"/>
+          </w:tcPr>
+          <w:p>
+            <w:r>
+              <w:t>MIT / TypeScript</w:t>
+            </w:r>
+          </w:p>
+        </w:tc>
+      </w:tr>
+      <w:tr>
+        <w:tc>
+          <w:tcPr>
+            <w:tcW w:type="dxa" w:w="2232"/>
+            <w:shd w:fill="EDF3F8"/>
+          </w:tcPr>
+          <w:p>
+            <w:r>
+              <w:t>Star / 周新增 / Fork</w:t>
+            </w:r>
+          </w:p>
+        </w:tc>
+        <w:tc>
+          <w:tcPr>
+            <w:tcW w:type="dxa" w:w="7128"/>
+          </w:tcPr>
+          <w:p>
+            <w:r>
+              <w:t>187,431 / 0 / 23,551</w:t>
+            </w:r>
+          </w:p>
+        </w:tc>
+      </w:tr>
+      <w:tr>
+        <w:tc>
+          <w:tcPr>
+            <w:tcW w:type="dxa" w:w="2232"/>
+            <w:shd w:fill="EDF3F8"/>
+          </w:tcPr>
+          <w:p>
+            <w:r>
+              <w:t>最近更新 / Release</w:t>
+            </w:r>
+          </w:p>
+        </w:tc>
+        <w:tc>
+          <w:tcPr>
+            <w:tcW w:type="dxa" w:w="7128"/>
+          </w:tcPr>
+          <w:p>
+            <w:r>
+              <w:t>2026-07-19 / v1.18.3</w:t>
+            </w:r>
+          </w:p>
+        </w:tc>
+      </w:tr>
+      <w:tr>
+        <w:tc>
+          <w:tcPr>
+            <w:tcW w:type="dxa" w:w="2232"/>
+            <w:shd w:fill="EDF3F8"/>
+          </w:tcPr>
+          <w:p>
+            <w:r>
+              <w:t>平台 / 难度</w:t>
+            </w:r>
+          </w:p>
+        </w:tc>
+        <w:tc>
+          <w:tcPr>
+            <w:tcW w:type="dxa" w:w="7128"/>
+          </w:tcPr>
+          <w:p>
+            <w:r>
+              <w:t>以官方 README 为准，通常支持 Windows、macOS 或 Linux 中的部分平台 / 中等</w:t>
+            </w:r>
+          </w:p>
+        </w:tc>
+      </w:tr>
+    </w:tbl>
+    <w:p>
+      <w:pPr>
+        <w:pStyle w:val="Heading3"/>
+      </w:pPr>
+      <w:r>
+        <w:t>项目介绍</w:t>
+      </w:r>
+    </w:p>
+    <w:p>
+      <w:r>
+        <w:t>opencode 是AI Agent领域项目。The open source coding agent.</w:t>
+      </w:r>
+    </w:p>
+    <w:p>
+      <w:pPr>
+        <w:pStyle w:val="Heading3"/>
+      </w:pPr>
+      <w:r>
+        <w:t>核心工作原理</w:t>
+      </w:r>
+    </w:p>
+    <w:p>
+      <w:r>
+        <w:t>通过可复用的开源组件、命令行或服务接口完成核心任务；具体架构以官方文档为准。</w:t>
+      </w:r>
+    </w:p>
+    <w:p>
+      <w:pPr>
+        <w:pStyle w:val="Heading3"/>
+      </w:pPr>
+      <w:r>
+        <w:t>为什么本周受到关注</w:t>
+      </w:r>
+    </w:p>
+    <w:p>
+      <w:r>
+        <w:t>近期提交活跃，综合热度得分 55.3；本周新增 Star 0。首次运行时增长数字可能为估算。</w:t>
+      </w:r>
+    </w:p>
+    <w:p>
+      <w:pPr>
+        <w:pStyle w:val="Heading3"/>
+      </w:pPr>
+      <w:r>
+        <w:t>适合人群</w:t>
+      </w:r>
+    </w:p>
+    <w:p>
+      <w:r>
+        <w:t>适合有一定编程基础的用户、专业开发者和评估型团队；零基础用户应优先选择带安装包或图形界面的项目。</w:t>
+      </w:r>
+    </w:p>
+    <w:p>
+      <w:pPr>
+        <w:pStyle w:val="Heading3"/>
+      </w:pPr>
+      <w:r>
+        <w:t>生产环境判断</w:t>
+      </w:r>
+    </w:p>
+    <w:p>
+      <w:r>
+        <w:t>需完成版本锁定、安全审计和压力测试后再决定</w:t>
+      </w:r>
+    </w:p>
+    <w:p>
+      <w:pPr>
+        <w:pStyle w:val="Heading3"/>
+      </w:pPr>
+      <w:r>
+        <w:t>核心功能</w:t>
+      </w:r>
+    </w:p>
+    <w:p>
+      <w:pPr>
+        <w:pStyle w:val="ListBullet"/>
+      </w:pPr>
+      <w:r>
+        <w:t>提供可复用的核心能力和公开源码</w:t>
+      </w:r>
+    </w:p>
+    <w:p>
+      <w:pPr>
+        <w:pStyle w:val="ListBullet"/>
+      </w:pPr>
+      <w:r>
+        <w:t>README 包含安装或使用线索</w:t>
+      </w:r>
+    </w:p>
+    <w:p>
+      <w:pPr>
+        <w:pStyle w:val="ListBullet"/>
+      </w:pPr>
+      <w:r>
+        <w:t>社区可通过 Issue 与 PR 协作</w:t>
+      </w:r>
+    </w:p>
+    <w:p>
+      <w:pPr>
+        <w:pStyle w:val="ListBullet"/>
+      </w:pPr>
+      <w:r>
+        <w:t>支持从最小示例逐步扩展</w:t>
+      </w:r>
+    </w:p>
+    <w:p>
+      <w:pPr>
+        <w:pStyle w:val="Heading3"/>
+      </w:pPr>
+      <w:r>
+        <w:t>实际应用场景</w:t>
+      </w:r>
+    </w:p>
+    <w:p>
+      <w:pPr>
+        <w:pStyle w:val="ListBullet"/>
+      </w:pPr>
+      <w:r>
+        <w:t>学生：用最小示例理解该领域的工程结构</w:t>
+      </w:r>
+    </w:p>
+    <w:p>
+      <w:pPr>
+        <w:pStyle w:val="ListBullet"/>
+      </w:pPr>
+      <w:r>
+        <w:t>程序员：在测试环境验证后集成到个人项目</w:t>
+      </w:r>
+    </w:p>
+    <w:p>
+      <w:pPr>
+        <w:pStyle w:val="ListBullet"/>
+      </w:pPr>
+      <w:r>
+        <w:t>团队：用于原型评估和技术选型对比</w:t>
+      </w:r>
+    </w:p>
+    <w:p>
+      <w:pPr>
+        <w:pStyle w:val="Heading3"/>
+      </w:pPr>
+      <w:r>
+        <w:t>快速上手</w:t>
+      </w:r>
+    </w:p>
+    <w:p>
+      <w:pPr>
+        <w:pStyle w:val="ListNumber"/>
+      </w:pPr>
+      <w:r>
+        <w:t>阅读官方 README 并确认系统要求</w:t>
+      </w:r>
+    </w:p>
+    <w:p>
+      <w:pPr>
+        <w:pStyle w:val="ListNumber"/>
+      </w:pPr>
+      <w:r>
+        <w:t>在隔离环境按官方命令安装</w:t>
+      </w:r>
+    </w:p>
+    <w:p>
+      <w:pPr>
+        <w:pStyle w:val="ListNumber"/>
+      </w:pPr>
+      <w:r>
+        <w:t>运行最小示例或演示项目</w:t>
+      </w:r>
+    </w:p>
+    <w:p>
+      <w:pPr>
+        <w:pStyle w:val="ListNumber"/>
+      </w:pPr>
+      <w:r>
+        <w:t>验证数据、权限和许可证后再扩大使用</w:t>
+      </w:r>
+    </w:p>
+    <w:p>
+      <w:pPr>
+        <w:pStyle w:val="Heading3"/>
+      </w:pPr>
+      <w:r>
+        <w:t>主要优点</w:t>
+      </w:r>
+    </w:p>
+    <w:p>
+      <w:pPr>
+        <w:pStyle w:val="ListBullet"/>
+      </w:pPr>
+      <w:r>
+        <w:t>近期活跃</w:t>
+      </w:r>
+    </w:p>
+    <w:p>
+      <w:pPr>
+        <w:pStyle w:val="ListBullet"/>
+      </w:pPr>
+      <w:r>
+        <w:t>源码透明</w:t>
+      </w:r>
+    </w:p>
+    <w:p>
+      <w:pPr>
+        <w:pStyle w:val="ListBullet"/>
+      </w:pPr>
+      <w:r>
+        <w:t>可从小规模试用</w:t>
+      </w:r>
+    </w:p>
+    <w:p>
+      <w:pPr>
+        <w:pStyle w:val="Heading3"/>
+      </w:pPr>
+      <w:r>
+        <w:t>局限与风险</w:t>
+      </w:r>
+    </w:p>
+    <w:p>
+      <w:pPr>
+        <w:pStyle w:val="ListBullet"/>
+      </w:pPr>
+      <w:r>
+        <w:t>热门不等于稳定</w:t>
+      </w:r>
+    </w:p>
+    <w:p>
+      <w:pPr>
+        <w:pStyle w:val="ListBullet"/>
+      </w:pPr>
+      <w:r>
+        <w:t>安装方式可能随版本变化</w:t>
+      </w:r>
+    </w:p>
+    <w:p>
+      <w:pPr>
+        <w:pStyle w:val="ListBullet"/>
+      </w:pPr>
+      <w:r>
+        <w:t>生产使用前需要安全审计</w:t>
+      </w:r>
+    </w:p>
+    <w:p>
+      <w:pPr>
+        <w:pStyle w:val="Heading3"/>
+      </w:pPr>
+      <w:r>
+        <w:t>评分与推荐理由</w:t>
+      </w:r>
+    </w:p>
+    <w:p>
+      <w:r>
+        <w:t>热度 2.8/5；实用性 4.0/5；创新性 3.8/5；易用性 3.2/5；项目成熟度 5.0/5；推荐指数 2.8/5。综合热度算法得分 55.3/100。</w:t>
+      </w:r>
+    </w:p>
+    <w:p>
+      <w:r>
+        <w:rPr>
+          <w:b/>
+        </w:rPr>
+        <w:t>项目地址：</w:t>
+      </w:r>
+      <w:hyperlink r:id="rId15">
+        <w:r>
+          <w:rPr>
+            <w:color w:val="0563C1"/>
+            <w:u w:val="single"/>
+          </w:rPr>
+          <w:t>https://github.com/anomalyco/opencode</w:t>
+        </w:r>
+      </w:hyperlink>
+    </w:p>
+    <w:p>
+      <w:r>
+        <w:rPr>
+          <w:b/>
+        </w:rPr>
+        <w:t>官方文档：</w:t>
+      </w:r>
+      <w:hyperlink r:id="rId30">
+        <w:r>
+          <w:rPr>
+            <w:color w:val="0563C1"/>
+            <w:u w:val="single"/>
+          </w:rPr>
+          <w:t>https://opencode.ai</w:t>
+        </w:r>
+      </w:hyperlink>
+    </w:p>
+    <w:p>
+      <w:r>
+        <w:rPr>
+          <w:b/>
+        </w:rPr>
+        <w:t>官方网站：</w:t>
+      </w:r>
+      <w:hyperlink r:id="rId30">
+        <w:r>
+          <w:rPr>
+            <w:color w:val="0563C1"/>
+            <w:u w:val="single"/>
+          </w:rPr>
+          <w:t>https://opencode.ai</w:t>
+        </w:r>
+      </w:hyperlink>
+    </w:p>
+    <w:p>
+      <w:r>
+        <w:br w:type="page"/>
+      </w:r>
+    </w:p>
+    <w:p>
+      <w:pPr>
+        <w:pStyle w:val="Heading2"/>
+      </w:pPr>
+      <w:r>
+        <w:t>3.6 vscode</w:t>
+      </w:r>
+    </w:p>
+    <w:p>
+      <w:r>
+        <w:drawing>
+          <wp:inline xmlns:a="http://schemas.openxmlformats.org/drawingml/2006/main" xmlns:pic="http://schemas.openxmlformats.org/drawingml/2006/picture">
+            <wp:extent cx="5760720" cy="3240405"/>
+            <wp:docPr id="7" name="Picture 7"/>
+            <wp:cNvGraphicFramePr>
+              <a:graphicFrameLocks noChangeAspect="1"/>
+            </wp:cNvGraphicFramePr>
+            <a:graphic>
+              <a:graphicData uri="http://schemas.openxmlformats.org/drawingml/2006/picture">
+                <pic:pic>
+                  <pic:nvPicPr>
+                    <pic:cNvPr id="0" name="microsoft__vscode.png"/>
+                    <pic:cNvPicPr/>
+                  </pic:nvPicPr>
+                  <pic:blipFill>
+                    <a:blip r:embed="rId31"/>
+                    <a:stretch>
+                      <a:fillRect/>
+                    </a:stretch>
+                  </pic:blipFill>
+                  <pic:spPr>
+                    <a:xfrm>
+                      <a:off x="0" y="0"/>
+                      <a:ext cx="5760720" cy="3240405"/>
+                    </a:xfrm>
+                    <a:prstGeom prst="rect"/>
+                  </pic:spPr>
+                </pic:pic>
+              </a:graphicData>
+            </a:graphic>
+          </wp:inline>
+        </w:drawing>
+      </w:r>
+    </w:p>
+    <w:p>
+      <w:pPr>
+        <w:jc w:val="center"/>
+      </w:pPr>
+      <w:r>
+        <w:t>非官方示意信息图</w:t>
+      </w:r>
+    </w:p>
+    <w:tbl>
+      <w:tblPr>
+        <w:tblW w:type="auto" w:w="0"/>
+        <w:tblLayout w:type="fixed"/>
+        <w:tblLook w:firstColumn="1" w:firstRow="1" w:lastColumn="0" w:lastRow="0" w:noHBand="0" w:noVBand="1" w:val="04A0"/>
+      </w:tblPr>
+      <w:tblGrid>
+        <w:gridCol w:w="4680"/>
+        <w:gridCol w:w="4680"/>
+      </w:tblGrid>
+      <w:tr>
+        <w:tc>
+          <w:tcPr>
+            <w:tcW w:type="dxa" w:w="2232"/>
+            <w:shd w:fill="EDF3F8"/>
+          </w:tcPr>
+          <w:p>
+            <w:r>
+              <w:t>仓库</w:t>
+            </w:r>
+          </w:p>
+        </w:tc>
+        <w:tc>
+          <w:tcPr>
+            <w:tcW w:type="dxa" w:w="7128"/>
+          </w:tcPr>
+          <w:p>
+            <w:r>
+              <w:t>microsoft/vscode</w:t>
+            </w:r>
+          </w:p>
+        </w:tc>
+      </w:tr>
+      <w:tr>
+        <w:tc>
+          <w:tcPr>
+            <w:tcW w:type="dxa" w:w="2232"/>
+            <w:shd w:fill="EDF3F8"/>
+          </w:tcPr>
+          <w:p>
+            <w:r>
+              <w:t>分类</w:t>
+            </w:r>
+          </w:p>
+        </w:tc>
+        <w:tc>
+          <w:tcPr>
+            <w:tcW w:type="dxa" w:w="7128"/>
+          </w:tcPr>
+          <w:p>
+            <w:r>
+              <w:t>Web 前端</w:t>
+            </w:r>
+          </w:p>
+        </w:tc>
+      </w:tr>
+      <w:tr>
+        <w:tc>
+          <w:tcPr>
+            <w:tcW w:type="dxa" w:w="2232"/>
+            <w:shd w:fill="EDF3F8"/>
+          </w:tcPr>
+          <w:p>
+            <w:r>
+              <w:t>许可证 / 语言</w:t>
+            </w:r>
+          </w:p>
+        </w:tc>
+        <w:tc>
+          <w:tcPr>
+            <w:tcW w:type="dxa" w:w="7128"/>
+          </w:tcPr>
+          <w:p>
+            <w:r>
+              <w:t>MIT / TypeScript</w:t>
+            </w:r>
+          </w:p>
+        </w:tc>
+      </w:tr>
+      <w:tr>
+        <w:tc>
+          <w:tcPr>
+            <w:tcW w:type="dxa" w:w="2232"/>
+            <w:shd w:fill="EDF3F8"/>
+          </w:tcPr>
+          <w:p>
+            <w:r>
+              <w:t>Star / 周新增 / Fork</w:t>
+            </w:r>
+          </w:p>
+        </w:tc>
+        <w:tc>
+          <w:tcPr>
+            <w:tcW w:type="dxa" w:w="7128"/>
+          </w:tcPr>
+          <w:p>
+            <w:r>
+              <w:t>187,678 / 0 / 41,294</w:t>
+            </w:r>
+          </w:p>
+        </w:tc>
+      </w:tr>
+      <w:tr>
+        <w:tc>
+          <w:tcPr>
+            <w:tcW w:type="dxa" w:w="2232"/>
+            <w:shd w:fill="EDF3F8"/>
+          </w:tcPr>
+          <w:p>
+            <w:r>
+              <w:t>最近更新 / Release</w:t>
+            </w:r>
+          </w:p>
+        </w:tc>
+        <w:tc>
+          <w:tcPr>
+            <w:tcW w:type="dxa" w:w="7128"/>
+          </w:tcPr>
+          <w:p>
+            <w:r>
+              <w:t>2026-07-19 / 1.129.1</w:t>
+            </w:r>
+          </w:p>
+        </w:tc>
+      </w:tr>
+      <w:tr>
+        <w:tc>
+          <w:tcPr>
+            <w:tcW w:type="dxa" w:w="2232"/>
+            <w:shd w:fill="EDF3F8"/>
+          </w:tcPr>
+          <w:p>
+            <w:r>
+              <w:t>平台 / 难度</w:t>
+            </w:r>
+          </w:p>
+        </w:tc>
+        <w:tc>
+          <w:tcPr>
+            <w:tcW w:type="dxa" w:w="7128"/>
+          </w:tcPr>
+          <w:p>
+            <w:r>
+              <w:t>以官方 README 为准，通常支持 Windows、macOS 或 Linux 中的部分平台 / 中等</w:t>
+            </w:r>
+          </w:p>
+        </w:tc>
+      </w:tr>
+    </w:tbl>
+    <w:p>
+      <w:pPr>
+        <w:pStyle w:val="Heading3"/>
+      </w:pPr>
+      <w:r>
+        <w:t>项目介绍</w:t>
+      </w:r>
+    </w:p>
+    <w:p>
+      <w:r>
+        <w:t>vscode 是Web 前端领域项目。Visual Studio Code</w:t>
+      </w:r>
+    </w:p>
+    <w:p>
+      <w:pPr>
+        <w:pStyle w:val="Heading3"/>
+      </w:pPr>
+      <w:r>
+        <w:t>核心工作原理</w:t>
+      </w:r>
+    </w:p>
+    <w:p>
+      <w:r>
+        <w:t>通过可复用的开源组件、命令行或服务接口完成核心任务；具体架构以官方文档为准。</w:t>
+      </w:r>
+    </w:p>
+    <w:p>
+      <w:pPr>
+        <w:pStyle w:val="Heading3"/>
+      </w:pPr>
+      <w:r>
+        <w:t>为什么本周受到关注</w:t>
+      </w:r>
+    </w:p>
+    <w:p>
+      <w:r>
+        <w:t>近期提交活跃，综合热度得分 55.2；本周新增 Star 0。首次运行时增长数字可能为估算。</w:t>
+      </w:r>
+    </w:p>
+    <w:p>
+      <w:pPr>
+        <w:pStyle w:val="Heading3"/>
+      </w:pPr>
+      <w:r>
+        <w:t>适合人群</w:t>
+      </w:r>
+    </w:p>
+    <w:p>
+      <w:r>
+        <w:t>适合有一定编程基础的用户、专业开发者和评估型团队；零基础用户应优先选择带安装包或图形界面的项目。</w:t>
+      </w:r>
+    </w:p>
+    <w:p>
+      <w:pPr>
+        <w:pStyle w:val="Heading3"/>
+      </w:pPr>
+      <w:r>
+        <w:t>生产环境判断</w:t>
+      </w:r>
+    </w:p>
+    <w:p>
+      <w:r>
+        <w:t>需完成版本锁定、安全审计和压力测试后再决定</w:t>
+      </w:r>
+    </w:p>
+    <w:p>
+      <w:pPr>
+        <w:pStyle w:val="Heading3"/>
+      </w:pPr>
+      <w:r>
+        <w:t>核心功能</w:t>
+      </w:r>
+    </w:p>
+    <w:p>
+      <w:pPr>
+        <w:pStyle w:val="ListBullet"/>
+      </w:pPr>
+      <w:r>
+        <w:t>提供可复用的核心能力和公开源码</w:t>
+      </w:r>
+    </w:p>
+    <w:p>
+      <w:pPr>
+        <w:pStyle w:val="ListBullet"/>
+      </w:pPr>
+      <w:r>
+        <w:t>README 包含安装或使用线索</w:t>
+      </w:r>
+    </w:p>
+    <w:p>
+      <w:pPr>
+        <w:pStyle w:val="ListBullet"/>
+      </w:pPr>
+      <w:r>
+        <w:t>社区可通过 Issue 与 PR 协作</w:t>
+      </w:r>
+    </w:p>
+    <w:p>
+      <w:pPr>
+        <w:pStyle w:val="ListBullet"/>
+      </w:pPr>
+      <w:r>
+        <w:t>支持从最小示例逐步扩展</w:t>
+      </w:r>
+    </w:p>
+    <w:p>
+      <w:pPr>
+        <w:pStyle w:val="Heading3"/>
+      </w:pPr>
+      <w:r>
+        <w:t>实际应用场景</w:t>
+      </w:r>
+    </w:p>
+    <w:p>
+      <w:pPr>
+        <w:pStyle w:val="ListBullet"/>
+      </w:pPr>
+      <w:r>
+        <w:t>学生：用最小示例理解该领域的工程结构</w:t>
+      </w:r>
+    </w:p>
+    <w:p>
+      <w:pPr>
+        <w:pStyle w:val="ListBullet"/>
+      </w:pPr>
+      <w:r>
+        <w:t>程序员：在测试环境验证后集成到个人项目</w:t>
+      </w:r>
+    </w:p>
+    <w:p>
+      <w:pPr>
+        <w:pStyle w:val="ListBullet"/>
+      </w:pPr>
+      <w:r>
+        <w:t>团队：用于原型评估和技术选型对比</w:t>
+      </w:r>
+    </w:p>
+    <w:p>
+      <w:pPr>
+        <w:pStyle w:val="Heading3"/>
+      </w:pPr>
+      <w:r>
+        <w:t>快速上手</w:t>
+      </w:r>
+    </w:p>
+    <w:p>
+      <w:pPr>
+        <w:pStyle w:val="ListNumber"/>
+      </w:pPr>
+      <w:r>
+        <w:t>阅读官方 README 并确认系统要求</w:t>
+      </w:r>
+    </w:p>
+    <w:p>
+      <w:pPr>
+        <w:pStyle w:val="ListNumber"/>
+      </w:pPr>
+      <w:r>
+        <w:t>在隔离环境按官方命令安装</w:t>
+      </w:r>
+    </w:p>
+    <w:p>
+      <w:pPr>
+        <w:pStyle w:val="ListNumber"/>
+      </w:pPr>
+      <w:r>
+        <w:t>运行最小示例或演示项目</w:t>
+      </w:r>
+    </w:p>
+    <w:p>
+      <w:pPr>
+        <w:pStyle w:val="ListNumber"/>
+      </w:pPr>
+      <w:r>
+        <w:t>验证数据、权限和许可证后再扩大使用</w:t>
+      </w:r>
+    </w:p>
+    <w:p>
+      <w:pPr>
+        <w:pStyle w:val="Heading3"/>
+      </w:pPr>
+      <w:r>
+        <w:t>主要优点</w:t>
+      </w:r>
+    </w:p>
+    <w:p>
+      <w:pPr>
+        <w:pStyle w:val="ListBullet"/>
+      </w:pPr>
+      <w:r>
+        <w:t>近期活跃</w:t>
+      </w:r>
+    </w:p>
+    <w:p>
+      <w:pPr>
+        <w:pStyle w:val="ListBullet"/>
+      </w:pPr>
+      <w:r>
+        <w:t>源码透明</w:t>
+      </w:r>
+    </w:p>
+    <w:p>
+      <w:pPr>
+        <w:pStyle w:val="ListBullet"/>
+      </w:pPr>
+      <w:r>
+        <w:t>可从小规模试用</w:t>
+      </w:r>
+    </w:p>
+    <w:p>
+      <w:pPr>
+        <w:pStyle w:val="Heading3"/>
+      </w:pPr>
+      <w:r>
+        <w:t>局限与风险</w:t>
+      </w:r>
+    </w:p>
+    <w:p>
+      <w:pPr>
+        <w:pStyle w:val="ListBullet"/>
+      </w:pPr>
+      <w:r>
+        <w:t>热门不等于稳定</w:t>
+      </w:r>
+    </w:p>
+    <w:p>
+      <w:pPr>
+        <w:pStyle w:val="ListBullet"/>
+      </w:pPr>
+      <w:r>
+        <w:t>安装方式可能随版本变化</w:t>
+      </w:r>
+    </w:p>
+    <w:p>
+      <w:pPr>
+        <w:pStyle w:val="ListBullet"/>
+      </w:pPr>
+      <w:r>
+        <w:t>生产使用前需要安全审计</w:t>
+      </w:r>
+    </w:p>
+    <w:p>
+      <w:pPr>
+        <w:pStyle w:val="Heading3"/>
+      </w:pPr>
+      <w:r>
+        <w:t>评分与推荐理由</w:t>
+      </w:r>
+    </w:p>
+    <w:p>
+      <w:r>
+        <w:t>热度 2.8/5；实用性 4.0/5；创新性 3.8/5；易用性 3.2/5；项目成熟度 5.0/5；推荐指数 2.8/5。综合热度算法得分 55.2/100。</w:t>
+      </w:r>
+    </w:p>
+    <w:p>
+      <w:r>
+        <w:rPr>
+          <w:b/>
+        </w:rPr>
+        <w:t>项目地址：</w:t>
+      </w:r>
+      <w:hyperlink r:id="rId16">
+        <w:r>
+          <w:rPr>
+            <w:color w:val="0563C1"/>
+            <w:u w:val="single"/>
+          </w:rPr>
+          <w:t>https://github.com/microsoft/vscode</w:t>
+        </w:r>
+      </w:hyperlink>
+    </w:p>
+    <w:p>
+      <w:r>
+        <w:rPr>
+          <w:b/>
+        </w:rPr>
+        <w:t>官方文档：</w:t>
+      </w:r>
+      <w:hyperlink r:id="rId32">
+        <w:r>
+          <w:rPr>
+            <w:color w:val="0563C1"/>
+            <w:u w:val="single"/>
+          </w:rPr>
+          <w:t>https://code.visualstudio.com</w:t>
+        </w:r>
+      </w:hyperlink>
+    </w:p>
+    <w:p>
+      <w:r>
+        <w:rPr>
+          <w:b/>
+        </w:rPr>
+        <w:t>官方网站：</w:t>
+      </w:r>
+      <w:hyperlink r:id="rId32">
+        <w:r>
+          <w:rPr>
+            <w:color w:val="0563C1"/>
+            <w:u w:val="single"/>
+          </w:rPr>
+          <w:t>https://code.visualstudio.com</w:t>
+        </w:r>
+      </w:hyperlink>
+    </w:p>
+    <w:p>
+      <w:r>
+        <w:br w:type="page"/>
+      </w:r>
+    </w:p>
+    <w:p>
+      <w:pPr>
+        <w:pStyle w:val="Heading2"/>
+      </w:pPr>
+      <w:r>
+        <w:t>3.7 skills</w:t>
+      </w:r>
+    </w:p>
+    <w:p>
+      <w:r>
+        <w:drawing>
+          <wp:inline xmlns:a="http://schemas.openxmlformats.org/drawingml/2006/main" xmlns:pic="http://schemas.openxmlformats.org/drawingml/2006/picture">
+            <wp:extent cx="5760720" cy="3240405"/>
+            <wp:docPr id="8" name="Picture 8"/>
+            <wp:cNvGraphicFramePr>
+              <a:graphicFrameLocks noChangeAspect="1"/>
+            </wp:cNvGraphicFramePr>
+            <a:graphic>
+              <a:graphicData uri="http://schemas.openxmlformats.org/drawingml/2006/picture">
+                <pic:pic>
+                  <pic:nvPicPr>
+                    <pic:cNvPr id="0" name="mattpocock__skills.png"/>
+                    <pic:cNvPicPr/>
+                  </pic:nvPicPr>
+                  <pic:blipFill>
+                    <a:blip r:embed="rId33"/>
+                    <a:stretch>
+                      <a:fillRect/>
+                    </a:stretch>
+                  </pic:blipFill>
+                  <pic:spPr>
+                    <a:xfrm>
+                      <a:off x="0" y="0"/>
+                      <a:ext cx="5760720" cy="3240405"/>
+                    </a:xfrm>
+                    <a:prstGeom prst="rect"/>
+                  </pic:spPr>
+                </pic:pic>
+              </a:graphicData>
+            </a:graphic>
+          </wp:inline>
+        </w:drawing>
+      </w:r>
+    </w:p>
+    <w:p>
+      <w:pPr>
+        <w:jc w:val="center"/>
+      </w:pPr>
+      <w:r>
+        <w:t>非官方示意信息图</w:t>
+      </w:r>
+    </w:p>
+    <w:tbl>
+      <w:tblPr>
+        <w:tblW w:type="auto" w:w="0"/>
+        <w:tblLayout w:type="fixed"/>
+        <w:tblLook w:firstColumn="1" w:firstRow="1" w:lastColumn="0" w:lastRow="0" w:noHBand="0" w:noVBand="1" w:val="04A0"/>
+      </w:tblPr>
+      <w:tblGrid>
+        <w:gridCol w:w="4680"/>
+        <w:gridCol w:w="4680"/>
+      </w:tblGrid>
+      <w:tr>
+        <w:tc>
+          <w:tcPr>
+            <w:tcW w:type="dxa" w:w="2232"/>
+            <w:shd w:fill="EDF3F8"/>
+          </w:tcPr>
+          <w:p>
+            <w:r>
+              <w:t>仓库</w:t>
+            </w:r>
+          </w:p>
+        </w:tc>
+        <w:tc>
+          <w:tcPr>
+            <w:tcW w:type="dxa" w:w="7128"/>
+          </w:tcPr>
+          <w:p>
+            <w:r>
+              <w:t>mattpocock/skills</w:t>
+            </w:r>
+          </w:p>
+        </w:tc>
+      </w:tr>
+      <w:tr>
+        <w:tc>
+          <w:tcPr>
+            <w:tcW w:type="dxa" w:w="2232"/>
+            <w:shd w:fill="EDF3F8"/>
+          </w:tcPr>
+          <w:p>
+            <w:r>
+              <w:t>分类</w:t>
+            </w:r>
+          </w:p>
+        </w:tc>
+        <w:tc>
+          <w:tcPr>
+            <w:tcW w:type="dxa" w:w="7128"/>
+          </w:tcPr>
+          <w:p>
+            <w:r>
+              <w:t>AI Agent</w:t>
+            </w:r>
+          </w:p>
+        </w:tc>
+      </w:tr>
+      <w:tr>
+        <w:tc>
+          <w:tcPr>
+            <w:tcW w:type="dxa" w:w="2232"/>
+            <w:shd w:fill="EDF3F8"/>
+          </w:tcPr>
+          <w:p>
+            <w:r>
+              <w:t>许可证 / 语言</w:t>
+            </w:r>
+          </w:p>
+        </w:tc>
+        <w:tc>
+          <w:tcPr>
+            <w:tcW w:type="dxa" w:w="7128"/>
+          </w:tcPr>
+          <w:p>
+            <w:r>
+              <w:t>MIT / Shell</w:t>
+            </w:r>
+          </w:p>
+        </w:tc>
+      </w:tr>
+      <w:tr>
+        <w:tc>
+          <w:tcPr>
+            <w:tcW w:type="dxa" w:w="2232"/>
+            <w:shd w:fill="EDF3F8"/>
+          </w:tcPr>
+          <w:p>
+            <w:r>
+              <w:t>Star / 周新增 / Fork</w:t>
+            </w:r>
+          </w:p>
+        </w:tc>
+        <w:tc>
+          <w:tcPr>
+            <w:tcW w:type="dxa" w:w="7128"/>
+          </w:tcPr>
+          <w:p>
+            <w:r>
+              <w:t>177,201 / 0 / 15,193</w:t>
             </w:r>
           </w:p>
         </w:tc>
@@ -1304,7 +4538,7 @@
     </w:p>
     <w:p>
       <w:r>
-        <w:t>local-llm-kit 是人工智能与大模型领域项目。用于演示的人工智能与大模型开源项目，提供清晰安装教程与可运行示例。</w:t>
+        <w:t>skills 是AI Agent领域项目。Skills for Real Engineers. Straight from my .agents directory.</w:t>
       </w:r>
     </w:p>
     <w:p>
@@ -1330,7 +4564,7 @@
     </w:p>
     <w:p>
       <w:r>
-        <w:t>近期提交活跃，综合热度得分 57.4；本周新增 Star 0。首次运行时增长数字可能为估算。</w:t>
+        <w:t>近期提交活跃，综合热度得分 52.0；本周新增 Star 0。首次运行时增长数字可能为估算。</w:t>
       </w:r>
     </w:p>
     <w:p>
@@ -1545,7 +4779,7 @@
     </w:p>
     <w:p>
       <w:r>
-        <w:t>热度 2.9/5；实用性 4.0/5；创新性 3.8/5；易用性 3.2/5；项目成熟度 3.4/5；推荐指数 2.9/5。综合热度算法得分 57.4/100。</w:t>
+        <w:t>热度 2.6/5；实用性 4.0/5；创新性 3.8/5；易用性 3.2/5；项目成熟度 5.0/5；推荐指数 2.6/5。综合热度算法得分 52.0/100。</w:t>
       </w:r>
     </w:p>
     <w:p>
@@ -1555,13 +4789,13 @@
         </w:rPr>
         <w:t>项目地址：</w:t>
       </w:r>
-      <w:hyperlink r:id="rId12">
+      <w:hyperlink r:id="rId17">
         <w:r>
           <w:rPr>
             <w:color w:val="0563C1"/>
             <w:u w:val="single"/>
           </w:rPr>
-          <w:t>https://github.com/demo/local-llm-kit</w:t>
+          <w:t>https://github.com/mattpocock/skills</w:t>
         </w:r>
       </w:hyperlink>
     </w:p>
@@ -1572,35 +4806,18 @@
         </w:rPr>
         <w:t>官方文档：</w:t>
       </w:r>
-      <w:hyperlink r:id="rId18">
+      <w:hyperlink r:id="rId34">
         <w:r>
           <w:rPr>
             <w:color w:val="0563C1"/>
             <w:u w:val="single"/>
           </w:rPr>
-          <w:t>https://example.com/local-llm-kit/docs</w:t>
+          <w:t>https://github.com/mattpocock/skills#readme</w:t>
         </w:r>
       </w:hyperlink>
     </w:p>
     <w:p>
       <w:r>
-        <w:rPr>
-          <w:b/>
-        </w:rPr>
-        <w:t>官方网站：</w:t>
-      </w:r>
-      <w:hyperlink r:id="rId19">
-        <w:r>
-          <w:rPr>
-            <w:color w:val="0563C1"/>
-            <w:u w:val="single"/>
-          </w:rPr>
-          <w:t>https://example.com/local-llm-kit</w:t>
-        </w:r>
-      </w:hyperlink>
-    </w:p>
-    <w:p>
-      <w:r>
         <w:br w:type="page"/>
       </w:r>
     </w:p>
@@ -1609,7 +4826,7 @@
         <w:pStyle w:val="Heading2"/>
       </w:pPr>
       <w:r>
-        <w:t>3.3 swift-web</w:t>
+        <w:t>3.8 Aether</w:t>
       </w:r>
     </w:p>
     <w:p>
@@ -1617,7 +4834,7 @@
         <w:drawing>
           <wp:inline xmlns:a="http://schemas.openxmlformats.org/drawingml/2006/main" xmlns:pic="http://schemas.openxmlformats.org/drawingml/2006/picture">
             <wp:extent cx="5760720" cy="3240405"/>
-            <wp:docPr id="4" name="Picture 4"/>
+            <wp:docPr id="9" name="Picture 9"/>
             <wp:cNvGraphicFramePr>
               <a:graphicFrameLocks noChangeAspect="1"/>
             </wp:cNvGraphicFramePr>
@@ -1625,11 +4842,11 @@
               <a:graphicData uri="http://schemas.openxmlformats.org/drawingml/2006/picture">
                 <pic:pic>
                   <pic:nvPicPr>
-                    <pic:cNvPr id="0" name="demo__swift-web.png"/>
+                    <pic:cNvPr id="0" name="CluvexStudio__Aether.png"/>
                     <pic:cNvPicPr/>
                   </pic:nvPicPr>
                   <pic:blipFill>
-                    <a:blip r:embed="rId20"/>
+                    <a:blip r:embed="rId35"/>
                     <a:stretch>
                       <a:fillRect/>
                     </a:stretch>
@@ -1684,7 +4901,7 @@
           </w:tcPr>
           <w:p>
             <w:r>
-              <w:t>demo/swift-web</w:t>
+              <w:t>CluvexStudio/Aether</w:t>
             </w:r>
           </w:p>
         </w:tc>
@@ -1730,7 +4947,7 @@
           </w:tcPr>
           <w:p>
             <w:r>
-              <w:t>MIT / TypeScript</w:t>
+              <w:t>AGPL-3.0 / Rust</w:t>
             </w:r>
           </w:p>
         </w:tc>
@@ -1753,7 +4970,7 @@
           </w:tcPr>
           <w:p>
             <w:r>
-              <w:t>26,400 / 0 / 1,960</w:t>
+              <w:t>1,293 / 0 / 77</w:t>
             </w:r>
           </w:p>
         </w:tc>
@@ -1815,7 +5032,7 @@
     </w:p>
     <w:p>
       <w:r>
-        <w:t>swift-web 是编程开发工具领域项目。用于演示的Web 前端开源项目，提供清晰安装教程与可运行示例。</w:t>
+        <w:t>Aether 是编程开发工具领域项目。一个仍需阅读官方说明进一步确认定位的开源项目</w:t>
       </w:r>
     </w:p>
     <w:p>
@@ -1841,7 +5058,7 @@
     </w:p>
     <w:p>
       <w:r>
-        <w:t>近期提交活跃，综合热度得分 56.6；本周新增 Star 0。首次运行时增长数字可能为估算。</w:t>
+        <w:t>近期提交活跃，综合热度得分 50.9；本周新增 Star 0。首次运行时增长数字可能为估算。</w:t>
       </w:r>
     </w:p>
     <w:p>
@@ -2056,7 +5273,7 @@
     </w:p>
     <w:p>
       <w:r>
-        <w:t>热度 2.8/5；实用性 4.0/5；创新性 3.8/5；易用性 3.2/5；项目成熟度 3.4/5；推荐指数 2.8/5。综合热度算法得分 56.6/100。</w:t>
+        <w:t>热度 2.5/5；实用性 4.0/5；创新性 3.8/5；易用性 3.2/5；项目成熟度 2.5/5；推荐指数 2.5/5。综合热度算法得分 50.9/100。</w:t>
       </w:r>
     </w:p>
     <w:p>
@@ -2066,13 +5283,13 @@
         </w:rPr>
         <w:t>项目地址：</w:t>
       </w:r>
-      <w:hyperlink r:id="rId13">
+      <w:hyperlink r:id="rId18">
         <w:r>
           <w:rPr>
             <w:color w:val="0563C1"/>
             <w:u w:val="single"/>
           </w:rPr>
-          <w:t>https://github.com/demo/swift-web</w:t>
+          <w:t>https://github.com/CluvexStudio/Aether</w:t>
         </w:r>
       </w:hyperlink>
     </w:p>
@@ -2083,40 +5300,1028 @@
         </w:rPr>
         <w:t>官方文档：</w:t>
       </w:r>
-      <w:hyperlink r:id="rId21">
+      <w:hyperlink r:id="rId36">
         <w:r>
           <w:rPr>
             <w:color w:val="0563C1"/>
             <w:u w:val="single"/>
           </w:rPr>
-          <w:t>https://example.com/swift-web/docs</w:t>
+          <w:t>https://github.com/CluvexStudio/Aether#readme</w:t>
         </w:r>
       </w:hyperlink>
+    </w:p>
+    <w:p>
+      <w:r>
+        <w:br w:type="page"/>
+      </w:r>
+    </w:p>
+    <w:p>
+      <w:pPr>
+        <w:pStyle w:val="Heading2"/>
+      </w:pPr>
+      <w:r>
+        <w:t>3.9 Aether-GUI</w:t>
+      </w:r>
+    </w:p>
+    <w:p>
+      <w:r>
+        <w:drawing>
+          <wp:inline xmlns:a="http://schemas.openxmlformats.org/drawingml/2006/main" xmlns:pic="http://schemas.openxmlformats.org/drawingml/2006/picture">
+            <wp:extent cx="5760720" cy="3240405"/>
+            <wp:docPr id="10" name="Picture 10"/>
+            <wp:cNvGraphicFramePr>
+              <a:graphicFrameLocks noChangeAspect="1"/>
+            </wp:cNvGraphicFramePr>
+            <a:graphic>
+              <a:graphicData uri="http://schemas.openxmlformats.org/drawingml/2006/picture">
+                <pic:pic>
+                  <pic:nvPicPr>
+                    <pic:cNvPr id="0" name="MatinSenPai__Aether-GUI.png"/>
+                    <pic:cNvPicPr/>
+                  </pic:nvPicPr>
+                  <pic:blipFill>
+                    <a:blip r:embed="rId37"/>
+                    <a:stretch>
+                      <a:fillRect/>
+                    </a:stretch>
+                  </pic:blipFill>
+                  <pic:spPr>
+                    <a:xfrm>
+                      <a:off x="0" y="0"/>
+                      <a:ext cx="5760720" cy="3240405"/>
+                    </a:xfrm>
+                    <a:prstGeom prst="rect"/>
+                  </pic:spPr>
+                </pic:pic>
+              </a:graphicData>
+            </a:graphic>
+          </wp:inline>
+        </w:drawing>
+      </w:r>
+    </w:p>
+    <w:p>
+      <w:pPr>
+        <w:jc w:val="center"/>
+      </w:pPr>
+      <w:r>
+        <w:t>非官方示意信息图</w:t>
+      </w:r>
+    </w:p>
+    <w:tbl>
+      <w:tblPr>
+        <w:tblW w:type="auto" w:w="0"/>
+        <w:tblLayout w:type="fixed"/>
+        <w:tblLook w:firstColumn="1" w:firstRow="1" w:lastColumn="0" w:lastRow="0" w:noHBand="0" w:noVBand="1" w:val="04A0"/>
+      </w:tblPr>
+      <w:tblGrid>
+        <w:gridCol w:w="4680"/>
+        <w:gridCol w:w="4680"/>
+      </w:tblGrid>
+      <w:tr>
+        <w:tc>
+          <w:tcPr>
+            <w:tcW w:type="dxa" w:w="2232"/>
+            <w:shd w:fill="EDF3F8"/>
+          </w:tcPr>
+          <w:p>
+            <w:r>
+              <w:t>仓库</w:t>
+            </w:r>
+          </w:p>
+        </w:tc>
+        <w:tc>
+          <w:tcPr>
+            <w:tcW w:type="dxa" w:w="7128"/>
+          </w:tcPr>
+          <w:p>
+            <w:r>
+              <w:t>MatinSenPai/Aether-GUI</w:t>
+            </w:r>
+          </w:p>
+        </w:tc>
+      </w:tr>
+      <w:tr>
+        <w:tc>
+          <w:tcPr>
+            <w:tcW w:type="dxa" w:w="2232"/>
+            <w:shd w:fill="EDF3F8"/>
+          </w:tcPr>
+          <w:p>
+            <w:r>
+              <w:t>分类</w:t>
+            </w:r>
+          </w:p>
+        </w:tc>
+        <w:tc>
+          <w:tcPr>
+            <w:tcW w:type="dxa" w:w="7128"/>
+          </w:tcPr>
+          <w:p>
+            <w:r>
+              <w:t>Web 前端</w:t>
+            </w:r>
+          </w:p>
+        </w:tc>
+      </w:tr>
+      <w:tr>
+        <w:tc>
+          <w:tcPr>
+            <w:tcW w:type="dxa" w:w="2232"/>
+            <w:shd w:fill="EDF3F8"/>
+          </w:tcPr>
+          <w:p>
+            <w:r>
+              <w:t>许可证 / 语言</w:t>
+            </w:r>
+          </w:p>
+        </w:tc>
+        <w:tc>
+          <w:tcPr>
+            <w:tcW w:type="dxa" w:w="7128"/>
+          </w:tcPr>
+          <w:p>
+            <w:r>
+              <w:t>AGPL-3.0 / TypeScript</w:t>
+            </w:r>
+          </w:p>
+        </w:tc>
+      </w:tr>
+      <w:tr>
+        <w:tc>
+          <w:tcPr>
+            <w:tcW w:type="dxa" w:w="2232"/>
+            <w:shd w:fill="EDF3F8"/>
+          </w:tcPr>
+          <w:p>
+            <w:r>
+              <w:t>Star / 周新增 / Fork</w:t>
+            </w:r>
+          </w:p>
+        </w:tc>
+        <w:tc>
+          <w:tcPr>
+            <w:tcW w:type="dxa" w:w="7128"/>
+          </w:tcPr>
+          <w:p>
+            <w:r>
+              <w:t>616 / 0 / 27</w:t>
+            </w:r>
+          </w:p>
+        </w:tc>
+      </w:tr>
+      <w:tr>
+        <w:tc>
+          <w:tcPr>
+            <w:tcW w:type="dxa" w:w="2232"/>
+            <w:shd w:fill="EDF3F8"/>
+          </w:tcPr>
+          <w:p>
+            <w:r>
+              <w:t>最近更新 / Release</w:t>
+            </w:r>
+          </w:p>
+        </w:tc>
+        <w:tc>
+          <w:tcPr>
+            <w:tcW w:type="dxa" w:w="7128"/>
+          </w:tcPr>
+          <w:p>
+            <w:r>
+              <w:t>2026-07-19 / v0.4.0</w:t>
+            </w:r>
+          </w:p>
+        </w:tc>
+      </w:tr>
+      <w:tr>
+        <w:tc>
+          <w:tcPr>
+            <w:tcW w:type="dxa" w:w="2232"/>
+            <w:shd w:fill="EDF3F8"/>
+          </w:tcPr>
+          <w:p>
+            <w:r>
+              <w:t>平台 / 难度</w:t>
+            </w:r>
+          </w:p>
+        </w:tc>
+        <w:tc>
+          <w:tcPr>
+            <w:tcW w:type="dxa" w:w="7128"/>
+          </w:tcPr>
+          <w:p>
+            <w:r>
+              <w:t>以官方 README 为准，通常支持 Windows、macOS 或 Linux 中的部分平台 / 中等</w:t>
+            </w:r>
+          </w:p>
+        </w:tc>
+      </w:tr>
+    </w:tbl>
+    <w:p>
+      <w:pPr>
+        <w:pStyle w:val="Heading3"/>
+      </w:pPr>
+      <w:r>
+        <w:t>项目介绍</w:t>
+      </w:r>
+    </w:p>
+    <w:p>
+      <w:r>
+        <w:t>Aether-GUI 是Web 前端领域项目。One-click desktop GUI for the Aether censorship-circumvention tunnel — Tauri v2, React 19, Rust</w:t>
+      </w:r>
+    </w:p>
+    <w:p>
+      <w:pPr>
+        <w:pStyle w:val="Heading3"/>
+      </w:pPr>
+      <w:r>
+        <w:t>核心工作原理</w:t>
+      </w:r>
+    </w:p>
+    <w:p>
+      <w:r>
+        <w:t>通过可复用的开源组件、命令行或服务接口完成核心任务；具体架构以官方文档为准。</w:t>
+      </w:r>
+    </w:p>
+    <w:p>
+      <w:pPr>
+        <w:pStyle w:val="Heading3"/>
+      </w:pPr>
+      <w:r>
+        <w:t>为什么本周受到关注</w:t>
+      </w:r>
+    </w:p>
+    <w:p>
+      <w:r>
+        <w:t>近期提交活跃，综合热度得分 49.5；本周新增 Star 0。首次运行时增长数字可能为估算。</w:t>
+      </w:r>
+    </w:p>
+    <w:p>
+      <w:pPr>
+        <w:pStyle w:val="Heading3"/>
+      </w:pPr>
+      <w:r>
+        <w:t>适合人群</w:t>
+      </w:r>
+    </w:p>
+    <w:p>
+      <w:r>
+        <w:t>适合有一定编程基础的用户、专业开发者和评估型团队；零基础用户应优先选择带安装包或图形界面的项目。</w:t>
+      </w:r>
+    </w:p>
+    <w:p>
+      <w:pPr>
+        <w:pStyle w:val="Heading3"/>
+      </w:pPr>
+      <w:r>
+        <w:t>生产环境判断</w:t>
+      </w:r>
+    </w:p>
+    <w:p>
+      <w:r>
+        <w:t>需完成版本锁定、安全审计和压力测试后再决定</w:t>
+      </w:r>
+    </w:p>
+    <w:p>
+      <w:pPr>
+        <w:pStyle w:val="Heading3"/>
+      </w:pPr>
+      <w:r>
+        <w:t>核心功能</w:t>
+      </w:r>
+    </w:p>
+    <w:p>
+      <w:pPr>
+        <w:pStyle w:val="ListBullet"/>
+      </w:pPr>
+      <w:r>
+        <w:t>提供可复用的核心能力和公开源码</w:t>
+      </w:r>
+    </w:p>
+    <w:p>
+      <w:pPr>
+        <w:pStyle w:val="ListBullet"/>
+      </w:pPr>
+      <w:r>
+        <w:t>README 包含安装或使用线索</w:t>
+      </w:r>
+    </w:p>
+    <w:p>
+      <w:pPr>
+        <w:pStyle w:val="ListBullet"/>
+      </w:pPr>
+      <w:r>
+        <w:t>社区可通过 Issue 与 PR 协作</w:t>
+      </w:r>
+    </w:p>
+    <w:p>
+      <w:pPr>
+        <w:pStyle w:val="ListBullet"/>
+      </w:pPr>
+      <w:r>
+        <w:t>支持从最小示例逐步扩展</w:t>
+      </w:r>
+    </w:p>
+    <w:p>
+      <w:pPr>
+        <w:pStyle w:val="Heading3"/>
+      </w:pPr>
+      <w:r>
+        <w:t>实际应用场景</w:t>
+      </w:r>
+    </w:p>
+    <w:p>
+      <w:pPr>
+        <w:pStyle w:val="ListBullet"/>
+      </w:pPr>
+      <w:r>
+        <w:t>学生：用最小示例理解该领域的工程结构</w:t>
+      </w:r>
+    </w:p>
+    <w:p>
+      <w:pPr>
+        <w:pStyle w:val="ListBullet"/>
+      </w:pPr>
+      <w:r>
+        <w:t>程序员：在测试环境验证后集成到个人项目</w:t>
+      </w:r>
+    </w:p>
+    <w:p>
+      <w:pPr>
+        <w:pStyle w:val="ListBullet"/>
+      </w:pPr>
+      <w:r>
+        <w:t>团队：用于原型评估和技术选型对比</w:t>
+      </w:r>
+    </w:p>
+    <w:p>
+      <w:pPr>
+        <w:pStyle w:val="Heading3"/>
+      </w:pPr>
+      <w:r>
+        <w:t>快速上手</w:t>
+      </w:r>
+    </w:p>
+    <w:p>
+      <w:pPr>
+        <w:pStyle w:val="ListNumber"/>
+      </w:pPr>
+      <w:r>
+        <w:t>阅读官方 README 并确认系统要求</w:t>
+      </w:r>
+    </w:p>
+    <w:p>
+      <w:pPr>
+        <w:pStyle w:val="ListNumber"/>
+      </w:pPr>
+      <w:r>
+        <w:t>在隔离环境按官方命令安装</w:t>
+      </w:r>
+    </w:p>
+    <w:p>
+      <w:pPr>
+        <w:pStyle w:val="ListNumber"/>
+      </w:pPr>
+      <w:r>
+        <w:t>运行最小示例或演示项目</w:t>
+      </w:r>
+    </w:p>
+    <w:p>
+      <w:pPr>
+        <w:pStyle w:val="ListNumber"/>
+      </w:pPr>
+      <w:r>
+        <w:t>验证数据、权限和许可证后再扩大使用</w:t>
+      </w:r>
+    </w:p>
+    <w:p>
+      <w:pPr>
+        <w:pStyle w:val="Heading3"/>
+      </w:pPr>
+      <w:r>
+        <w:t>主要优点</w:t>
+      </w:r>
+    </w:p>
+    <w:p>
+      <w:pPr>
+        <w:pStyle w:val="ListBullet"/>
+      </w:pPr>
+      <w:r>
+        <w:t>近期活跃</w:t>
+      </w:r>
+    </w:p>
+    <w:p>
+      <w:pPr>
+        <w:pStyle w:val="ListBullet"/>
+      </w:pPr>
+      <w:r>
+        <w:t>源码透明</w:t>
+      </w:r>
+    </w:p>
+    <w:p>
+      <w:pPr>
+        <w:pStyle w:val="ListBullet"/>
+      </w:pPr>
+      <w:r>
+        <w:t>可从小规模试用</w:t>
+      </w:r>
+    </w:p>
+    <w:p>
+      <w:pPr>
+        <w:pStyle w:val="Heading3"/>
+      </w:pPr>
+      <w:r>
+        <w:t>局限与风险</w:t>
+      </w:r>
+    </w:p>
+    <w:p>
+      <w:pPr>
+        <w:pStyle w:val="ListBullet"/>
+      </w:pPr>
+      <w:r>
+        <w:t>热门不等于稳定</w:t>
+      </w:r>
+    </w:p>
+    <w:p>
+      <w:pPr>
+        <w:pStyle w:val="ListBullet"/>
+      </w:pPr>
+      <w:r>
+        <w:t>安装方式可能随版本变化</w:t>
+      </w:r>
+    </w:p>
+    <w:p>
+      <w:pPr>
+        <w:pStyle w:val="ListBullet"/>
+      </w:pPr>
+      <w:r>
+        <w:t>生产使用前需要安全审计</w:t>
+      </w:r>
+    </w:p>
+    <w:p>
+      <w:pPr>
+        <w:pStyle w:val="Heading3"/>
+      </w:pPr>
+      <w:r>
+        <w:t>评分与推荐理由</w:t>
+      </w:r>
+    </w:p>
+    <w:p>
+      <w:r>
+        <w:t>热度 2.5/5；实用性 4.0/5；创新性 3.8/5；易用性 3.2/5；项目成熟度 2.5/5；推荐指数 2.5/5。综合热度算法得分 49.5/100。</w:t>
+      </w:r>
     </w:p>
     <w:p>
       <w:r>
         <w:rPr>
           <w:b/>
         </w:rPr>
-        <w:t>官方网站：</w:t>
-      </w:r>
-      <w:hyperlink r:id="rId22">
+        <w:t>项目地址：</w:t>
+      </w:r>
+      <w:hyperlink r:id="rId19">
         <w:r>
           <w:rPr>
             <w:color w:val="0563C1"/>
             <w:u w:val="single"/>
           </w:rPr>
-          <w:t>https://example.com/swift-web</w:t>
+          <w:t>https://github.com/MatinSenPai/Aether-GUI</w:t>
         </w:r>
       </w:hyperlink>
     </w:p>
     <w:p>
       <w:r>
+        <w:rPr>
+          <w:b/>
+        </w:rPr>
+        <w:t>官方文档：</w:t>
+      </w:r>
+      <w:hyperlink r:id="rId38">
+        <w:r>
+          <w:rPr>
+            <w:color w:val="0563C1"/>
+            <w:u w:val="single"/>
+          </w:rPr>
+          <w:t>https://github.com/MatinSenPai/Aether-GUI#readme</w:t>
+        </w:r>
+      </w:hyperlink>
+    </w:p>
+    <w:p>
+      <w:r>
         <w:br w:type="page"/>
       </w:r>
     </w:p>
     <w:p>
       <w:pPr>
+        <w:pStyle w:val="Heading2"/>
+      </w:pPr>
+      <w:r>
+        <w:t>3.10 yt-dlp</w:t>
+      </w:r>
+    </w:p>
+    <w:p>
+      <w:r>
+        <w:drawing>
+          <wp:inline xmlns:a="http://schemas.openxmlformats.org/drawingml/2006/main" xmlns:pic="http://schemas.openxmlformats.org/drawingml/2006/picture">
+            <wp:extent cx="5760720" cy="3240405"/>
+            <wp:docPr id="11" name="Picture 11"/>
+            <wp:cNvGraphicFramePr>
+              <a:graphicFrameLocks noChangeAspect="1"/>
+            </wp:cNvGraphicFramePr>
+            <a:graphic>
+              <a:graphicData uri="http://schemas.openxmlformats.org/drawingml/2006/picture">
+                <pic:pic>
+                  <pic:nvPicPr>
+                    <pic:cNvPr id="0" name="yt-dlp__yt-dlp.png"/>
+                    <pic:cNvPicPr/>
+                  </pic:nvPicPr>
+                  <pic:blipFill>
+                    <a:blip r:embed="rId39"/>
+                    <a:stretch>
+                      <a:fillRect/>
+                    </a:stretch>
+                  </pic:blipFill>
+                  <pic:spPr>
+                    <a:xfrm>
+                      <a:off x="0" y="0"/>
+                      <a:ext cx="5760720" cy="3240405"/>
+                    </a:xfrm>
+                    <a:prstGeom prst="rect"/>
+                  </pic:spPr>
+                </pic:pic>
+              </a:graphicData>
+            </a:graphic>
+          </wp:inline>
+        </w:drawing>
+      </w:r>
+    </w:p>
+    <w:p>
+      <w:pPr>
+        <w:jc w:val="center"/>
+      </w:pPr>
+      <w:r>
+        <w:t>非官方示意信息图</w:t>
+      </w:r>
+    </w:p>
+    <w:tbl>
+      <w:tblPr>
+        <w:tblW w:type="auto" w:w="0"/>
+        <w:tblLayout w:type="fixed"/>
+        <w:tblLook w:firstColumn="1" w:firstRow="1" w:lastColumn="0" w:lastRow="0" w:noHBand="0" w:noVBand="1" w:val="04A0"/>
+      </w:tblPr>
+      <w:tblGrid>
+        <w:gridCol w:w="4680"/>
+        <w:gridCol w:w="4680"/>
+      </w:tblGrid>
+      <w:tr>
+        <w:tc>
+          <w:tcPr>
+            <w:tcW w:type="dxa" w:w="2232"/>
+            <w:shd w:fill="EDF3F8"/>
+          </w:tcPr>
+          <w:p>
+            <w:r>
+              <w:t>仓库</w:t>
+            </w:r>
+          </w:p>
+        </w:tc>
+        <w:tc>
+          <w:tcPr>
+            <w:tcW w:type="dxa" w:w="7128"/>
+          </w:tcPr>
+          <w:p>
+            <w:r>
+              <w:t>yt-dlp/yt-dlp</w:t>
+            </w:r>
+          </w:p>
+        </w:tc>
+      </w:tr>
+      <w:tr>
+        <w:tc>
+          <w:tcPr>
+            <w:tcW w:type="dxa" w:w="2232"/>
+            <w:shd w:fill="EDF3F8"/>
+          </w:tcPr>
+          <w:p>
+            <w:r>
+              <w:t>分类</w:t>
+            </w:r>
+          </w:p>
+        </w:tc>
+        <w:tc>
+          <w:tcPr>
+            <w:tcW w:type="dxa" w:w="7128"/>
+          </w:tcPr>
+          <w:p>
+            <w:r>
+              <w:t>效率工具</w:t>
+            </w:r>
+          </w:p>
+        </w:tc>
+      </w:tr>
+      <w:tr>
+        <w:tc>
+          <w:tcPr>
+            <w:tcW w:type="dxa" w:w="2232"/>
+            <w:shd w:fill="EDF3F8"/>
+          </w:tcPr>
+          <w:p>
+            <w:r>
+              <w:t>许可证 / 语言</w:t>
+            </w:r>
+          </w:p>
+        </w:tc>
+        <w:tc>
+          <w:tcPr>
+            <w:tcW w:type="dxa" w:w="7128"/>
+          </w:tcPr>
+          <w:p>
+            <w:r>
+              <w:t>Unlicense / Python</w:t>
+            </w:r>
+          </w:p>
+        </w:tc>
+      </w:tr>
+      <w:tr>
+        <w:tc>
+          <w:tcPr>
+            <w:tcW w:type="dxa" w:w="2232"/>
+            <w:shd w:fill="EDF3F8"/>
+          </w:tcPr>
+          <w:p>
+            <w:r>
+              <w:t>Star / 周新增 / Fork</w:t>
+            </w:r>
+          </w:p>
+        </w:tc>
+        <w:tc>
+          <w:tcPr>
+            <w:tcW w:type="dxa" w:w="7128"/>
+          </w:tcPr>
+          <w:p>
+            <w:r>
+              <w:t>178,872 / 0 / 15,210</w:t>
+            </w:r>
+          </w:p>
+        </w:tc>
+      </w:tr>
+      <w:tr>
+        <w:tc>
+          <w:tcPr>
+            <w:tcW w:type="dxa" w:w="2232"/>
+            <w:shd w:fill="EDF3F8"/>
+          </w:tcPr>
+          <w:p>
+            <w:r>
+              <w:t>最近更新 / Release</w:t>
+            </w:r>
+          </w:p>
+        </w:tc>
+        <w:tc>
+          <w:tcPr>
+            <w:tcW w:type="dxa" w:w="7128"/>
+          </w:tcPr>
+          <w:p>
+            <w:r>
+              <w:t>2026-07-19 / 2026.07.04</w:t>
+            </w:r>
+          </w:p>
+        </w:tc>
+      </w:tr>
+      <w:tr>
+        <w:tc>
+          <w:tcPr>
+            <w:tcW w:type="dxa" w:w="2232"/>
+            <w:shd w:fill="EDF3F8"/>
+          </w:tcPr>
+          <w:p>
+            <w:r>
+              <w:t>平台 / 难度</w:t>
+            </w:r>
+          </w:p>
+        </w:tc>
+        <w:tc>
+          <w:tcPr>
+            <w:tcW w:type="dxa" w:w="7128"/>
+          </w:tcPr>
+          <w:p>
+            <w:r>
+              <w:t>以官方 README 为准，通常支持 Windows、macOS 或 Linux 中的部分平台 / 中等</w:t>
+            </w:r>
+          </w:p>
+        </w:tc>
+      </w:tr>
+    </w:tbl>
+    <w:p>
+      <w:pPr>
+        <w:pStyle w:val="Heading3"/>
+      </w:pPr>
+      <w:r>
+        <w:t>项目介绍</w:t>
+      </w:r>
+    </w:p>
+    <w:p>
+      <w:r>
+        <w:t>yt-dlp 是效率工具领域项目。A feature-rich command-line audio/video downloader</w:t>
+      </w:r>
+    </w:p>
+    <w:p>
+      <w:pPr>
+        <w:pStyle w:val="Heading3"/>
+      </w:pPr>
+      <w:r>
+        <w:t>核心工作原理</w:t>
+      </w:r>
+    </w:p>
+    <w:p>
+      <w:r>
+        <w:t>通过可复用的开源组件、命令行或服务接口完成核心任务；具体架构以官方文档为准。</w:t>
+      </w:r>
+    </w:p>
+    <w:p>
+      <w:pPr>
+        <w:pStyle w:val="Heading3"/>
+      </w:pPr>
+      <w:r>
+        <w:t>为什么本周受到关注</w:t>
+      </w:r>
+    </w:p>
+    <w:p>
+      <w:r>
+        <w:t>近期提交活跃，综合热度得分 48.3；本周新增 Star 0。首次运行时增长数字可能为估算。</w:t>
+      </w:r>
+    </w:p>
+    <w:p>
+      <w:pPr>
+        <w:pStyle w:val="Heading3"/>
+      </w:pPr>
+      <w:r>
+        <w:t>适合人群</w:t>
+      </w:r>
+    </w:p>
+    <w:p>
+      <w:r>
+        <w:t>适合有一定编程基础的用户、专业开发者和评估型团队；零基础用户应优先选择带安装包或图形界面的项目。</w:t>
+      </w:r>
+    </w:p>
+    <w:p>
+      <w:pPr>
+        <w:pStyle w:val="Heading3"/>
+      </w:pPr>
+      <w:r>
+        <w:t>生产环境判断</w:t>
+      </w:r>
+    </w:p>
+    <w:p>
+      <w:r>
+        <w:t>需完成版本锁定、安全审计和压力测试后再决定</w:t>
+      </w:r>
+    </w:p>
+    <w:p>
+      <w:pPr>
+        <w:pStyle w:val="Heading3"/>
+      </w:pPr>
+      <w:r>
+        <w:t>核心功能</w:t>
+      </w:r>
+    </w:p>
+    <w:p>
+      <w:pPr>
+        <w:pStyle w:val="ListBullet"/>
+      </w:pPr>
+      <w:r>
+        <w:t>提供可复用的核心能力和公开源码</w:t>
+      </w:r>
+    </w:p>
+    <w:p>
+      <w:pPr>
+        <w:pStyle w:val="ListBullet"/>
+      </w:pPr>
+      <w:r>
+        <w:t>README 包含安装或使用线索</w:t>
+      </w:r>
+    </w:p>
+    <w:p>
+      <w:pPr>
+        <w:pStyle w:val="ListBullet"/>
+      </w:pPr>
+      <w:r>
+        <w:t>社区可通过 Issue 与 PR 协作</w:t>
+      </w:r>
+    </w:p>
+    <w:p>
+      <w:pPr>
+        <w:pStyle w:val="ListBullet"/>
+      </w:pPr>
+      <w:r>
+        <w:t>支持从最小示例逐步扩展</w:t>
+      </w:r>
+    </w:p>
+    <w:p>
+      <w:pPr>
+        <w:pStyle w:val="Heading3"/>
+      </w:pPr>
+      <w:r>
+        <w:t>实际应用场景</w:t>
+      </w:r>
+    </w:p>
+    <w:p>
+      <w:pPr>
+        <w:pStyle w:val="ListBullet"/>
+      </w:pPr>
+      <w:r>
+        <w:t>学生：用最小示例理解该领域的工程结构</w:t>
+      </w:r>
+    </w:p>
+    <w:p>
+      <w:pPr>
+        <w:pStyle w:val="ListBullet"/>
+      </w:pPr>
+      <w:r>
+        <w:t>程序员：在测试环境验证后集成到个人项目</w:t>
+      </w:r>
+    </w:p>
+    <w:p>
+      <w:pPr>
+        <w:pStyle w:val="ListBullet"/>
+      </w:pPr>
+      <w:r>
+        <w:t>团队：用于原型评估和技术选型对比</w:t>
+      </w:r>
+    </w:p>
+    <w:p>
+      <w:pPr>
+        <w:pStyle w:val="Heading3"/>
+      </w:pPr>
+      <w:r>
+        <w:t>快速上手</w:t>
+      </w:r>
+    </w:p>
+    <w:p>
+      <w:pPr>
+        <w:pStyle w:val="ListNumber"/>
+      </w:pPr>
+      <w:r>
+        <w:t>阅读官方 README 并确认系统要求</w:t>
+      </w:r>
+    </w:p>
+    <w:p>
+      <w:pPr>
+        <w:pStyle w:val="ListNumber"/>
+      </w:pPr>
+      <w:r>
+        <w:t>在隔离环境按官方命令安装</w:t>
+      </w:r>
+    </w:p>
+    <w:p>
+      <w:pPr>
+        <w:pStyle w:val="ListNumber"/>
+      </w:pPr>
+      <w:r>
+        <w:t>运行最小示例或演示项目</w:t>
+      </w:r>
+    </w:p>
+    <w:p>
+      <w:pPr>
+        <w:pStyle w:val="ListNumber"/>
+      </w:pPr>
+      <w:r>
+        <w:t>验证数据、权限和许可证后再扩大使用</w:t>
+      </w:r>
+    </w:p>
+    <w:p>
+      <w:pPr>
+        <w:pStyle w:val="Heading3"/>
+      </w:pPr>
+      <w:r>
+        <w:t>主要优点</w:t>
+      </w:r>
+    </w:p>
+    <w:p>
+      <w:pPr>
+        <w:pStyle w:val="ListBullet"/>
+      </w:pPr>
+      <w:r>
+        <w:t>近期活跃</w:t>
+      </w:r>
+    </w:p>
+    <w:p>
+      <w:pPr>
+        <w:pStyle w:val="ListBullet"/>
+      </w:pPr>
+      <w:r>
+        <w:t>源码透明</w:t>
+      </w:r>
+    </w:p>
+    <w:p>
+      <w:pPr>
+        <w:pStyle w:val="ListBullet"/>
+      </w:pPr>
+      <w:r>
+        <w:t>可从小规模试用</w:t>
+      </w:r>
+    </w:p>
+    <w:p>
+      <w:pPr>
+        <w:pStyle w:val="Heading3"/>
+      </w:pPr>
+      <w:r>
+        <w:t>局限与风险</w:t>
+      </w:r>
+    </w:p>
+    <w:p>
+      <w:pPr>
+        <w:pStyle w:val="ListBullet"/>
+      </w:pPr>
+      <w:r>
+        <w:t>热门不等于稳定</w:t>
+      </w:r>
+    </w:p>
+    <w:p>
+      <w:pPr>
+        <w:pStyle w:val="ListBullet"/>
+      </w:pPr>
+      <w:r>
+        <w:t>安装方式可能随版本变化</w:t>
+      </w:r>
+    </w:p>
+    <w:p>
+      <w:pPr>
+        <w:pStyle w:val="ListBullet"/>
+      </w:pPr>
+      <w:r>
+        <w:t>生产使用前需要安全审计</w:t>
+      </w:r>
+    </w:p>
+    <w:p>
+      <w:pPr>
+        <w:pStyle w:val="Heading3"/>
+      </w:pPr>
+      <w:r>
+        <w:t>评分与推荐理由</w:t>
+      </w:r>
+    </w:p>
+    <w:p>
+      <w:r>
+        <w:t>热度 2.4/5；实用性 4.0/5；创新性 3.8/5；易用性 3.2/5；项目成熟度 5.0/5；推荐指数 2.4/5。综合热度算法得分 48.3/100。</w:t>
+      </w:r>
+    </w:p>
+    <w:p>
+      <w:r>
+        <w:rPr>
+          <w:b/>
+        </w:rPr>
+        <w:t>项目地址：</w:t>
+      </w:r>
+      <w:hyperlink r:id="rId20">
+        <w:r>
+          <w:rPr>
+            <w:color w:val="0563C1"/>
+            <w:u w:val="single"/>
+          </w:rPr>
+          <w:t>https://github.com/yt-dlp/yt-dlp</w:t>
+        </w:r>
+      </w:hyperlink>
+    </w:p>
+    <w:p>
+      <w:r>
+        <w:rPr>
+          <w:b/>
+        </w:rPr>
+        <w:t>官方文档：</w:t>
+      </w:r>
+      <w:hyperlink r:id="rId40">
+        <w:r>
+          <w:rPr>
+            <w:color w:val="0563C1"/>
+            <w:u w:val="single"/>
+          </w:rPr>
+          <w:t>https://discord.gg/H5MNcFW63r</w:t>
+        </w:r>
+      </w:hyperlink>
+    </w:p>
+    <w:p>
+      <w:r>
+        <w:rPr>
+          <w:b/>
+        </w:rPr>
+        <w:t>官方网站：</w:t>
+      </w:r>
+      <w:hyperlink r:id="rId40">
+        <w:r>
+          <w:rPr>
+            <w:color w:val="0563C1"/>
+            <w:u w:val="single"/>
+          </w:rPr>
+          <w:t>https://discord.gg/H5MNcFW63r</w:t>
+        </w:r>
+      </w:hyperlink>
+    </w:p>
+    <w:p>
+      <w:r>
+        <w:br w:type="page"/>
+      </w:r>
+    </w:p>
+    <w:p>
+      <w:pPr>
         <w:pStyle w:val="Heading1"/>
       </w:pPr>
       <w:r>
@@ -2125,7 +6330,7 @@
     </w:p>
     <w:p>
       <w:r>
-        <w:t>领域分布：{'人工智能与大模型': 2, '编程开发工具': 1}。语言分布：{'Python': 2, 'TypeScript': 1}。AI Agent、本地模型与开发者效率工具仍是需要重点观察的方向；新项目依靠快速增长进入榜单，成熟项目则常因新版本重新升温。应结合周增长和 Release 时间判断，而不是只看总 Star。</w:t>
+        <w:t>领域分布：{'人工智能与大模型': 3, '自动化工具': 1, 'AI Agent': 2, 'Web 前端': 2, '编程开发工具': 1, '效率工具': 1}。语言分布：{'TypeScript': 5, 'Go': 1, 'Python': 2, 'Shell': 1, 'Rust': 1}。AI Agent、本地模型与开发者效率工具仍是需要重点观察的方向；新项目依靠快速增长进入榜单，成熟项目则常因新版本重新升温。应结合周增长和 Release 时间判断，而不是只看总 Star。</w:t>
       </w:r>
     </w:p>
     <w:p>
@@ -2141,7 +6346,7 @@
         <w:pStyle w:val="ListBullet"/>
       </w:pPr>
       <w:r>
-        <w:t>最适合学生：agent-lab — agent-lab 是人工智能与大模型领域项目。用于演示的AI Agent开源项目，提供清晰安装教程与可运行示例。</w:t>
+        <w:t xml:space="preserve">最适合学生：openclaw — openclaw 是人工智能与大模型领域项目。Your own personal AI assistant. Any OS. Any Platform. The lobster way. 🦞 </w:t>
       </w:r>
     </w:p>
     <w:p>
@@ -2149,7 +6354,7 @@
         <w:pStyle w:val="ListBullet"/>
       </w:pPr>
       <w:r>
-        <w:t>最适合普通用户：local-llm-kit — local-llm-kit 是人工智能与大模型领域项目。用于演示的人工智能与大模型开源项目，提供清晰安装教程与可运行示例。</w:t>
+        <w:t>最适合普通用户：n8n — n8n 是自动化工具领域项目。Fair-code workflow automation platform with native AI capabilities. Combine visual building with custom code, self-host or cloud, 400+ integrations.</w:t>
       </w:r>
     </w:p>
     <w:p>
@@ -2157,7 +6362,7 @@
         <w:pStyle w:val="ListBullet"/>
       </w:pPr>
       <w:r>
-        <w:t>最适合程序员：swift-web — swift-web 是编程开发工具领域项目。用于演示的Web 前端开源项目，提供清晰安装教程与可运行示例。</w:t>
+        <w:t>最适合程序员：ollama — ollama 是人工智能与大模型领域项目。Get up and running with Kimi-K2.6, GLM-5.2, MiniMax, DeepSeek, gpt-oss, Qwen, Gemma and other models.</w:t>
       </w:r>
     </w:p>
     <w:p>
@@ -2165,7 +6370,7 @@
         <w:pStyle w:val="ListBullet"/>
       </w:pPr>
       <w:r>
-        <w:t>最适合独立开发者：agent-lab — agent-lab 是人工智能与大模型领域项目。用于演示的AI Agent开源项目，提供清晰安装教程与可运行示例。</w:t>
+        <w:t>最适合独立开发者：AutoGPT — AutoGPT 是人工智能与大模型领域项目。AutoGPT is the vision of accessible AI for everyone, to use and to build on. Our mission is to provide the tools, so that you can focus on what matters.</w:t>
       </w:r>
     </w:p>
     <w:p>
@@ -2173,7 +6378,7 @@
         <w:pStyle w:val="ListBullet"/>
       </w:pPr>
       <w:r>
-        <w:t>最适合企业团队：local-llm-kit — local-llm-kit 是人工智能与大模型领域项目。用于演示的人工智能与大模型开源项目，提供清晰安装教程与可运行示例。</w:t>
+        <w:t>最适合企业团队：opencode — opencode 是AI Agent领域项目。The open source coding agent.</w:t>
       </w:r>
     </w:p>
     <w:p>
@@ -2181,7 +6386,7 @@
         <w:pStyle w:val="ListBullet"/>
       </w:pPr>
       <w:r>
-        <w:t>最值得长期关注：swift-web — swift-web 是编程开发工具领域项目。用于演示的Web 前端开源项目，提供清晰安装教程与可运行示例。</w:t>
+        <w:t>最值得长期关注：vscode — vscode 是Web 前端领域项目。Visual Studio Code</w:t>
       </w:r>
     </w:p>
     <w:p>

</xml_diff>